<commit_message>
Sprint 2 ya terminado
</commit_message>
<xml_diff>
--- a/plantillas/Hoja_Inscripcion_Template.docx
+++ b/plantillas/Hoja_Inscripcion_Template.docx
@@ -41,52 +41,95 @@
     </w:p>
     <w:p>
       <w:pPr>
-        <w:rPr>
-          <w:lang w:val="es-MX"/>
-        </w:rPr>
-      </w:pPr>
-    </w:p>
-    <w:p>
-      <w:pPr>
-        <w:spacing w:line="276" w:lineRule="auto"/>
-        <w:jc w:val="right"/>
-        <w:rPr>
-          <w:lang w:val="es-MX"/>
-        </w:rPr>
-      </w:pPr>
-      <w:r>
-        <w:rPr>
-          <w:lang w:val="es-MX"/>
-        </w:rPr>
-        <w:t xml:space="preserve">Fecha: </w:t>
-      </w:r>
-      <w:r>
-        <w:rPr>
-          <w:lang w:val="es-MX"/>
-        </w:rPr>
-        <w:t>{{fecha_hoy}}</w:t>
-      </w:r>
-    </w:p>
-    <w:p>
-      <w:pPr>
         <w:spacing w:line="276" w:lineRule="auto"/>
         <w:rPr>
           <w:lang w:val="es-MX"/>
         </w:rPr>
       </w:pPr>
-      <w:r>
-        <w:rPr>
-          <w:lang w:val="es-MX"/>
-        </w:rPr>
-        <w:t xml:space="preserve">Folio: </w:t>
-      </w:r>
-      <w:r>
-        <w:rPr>
-          <w:lang w:val="es-MX"/>
-        </w:rPr>
-        <w:t>{{folio}}</w:t>
-      </w:r>
     </w:p>
+    <w:tbl>
+      <w:tblPr>
+        <w:tblStyle w:val="Tablaconcuadrcula"/>
+        <w:tblW w:w="5000" w:type="pct"/>
+        <w:tblLook w:val="04A0" w:firstRow="1" w:lastRow="0" w:firstColumn="1" w:lastColumn="0" w:noHBand="0" w:noVBand="1"/>
+      </w:tblPr>
+      <w:tblGrid>
+        <w:gridCol w:w="4325"/>
+        <w:gridCol w:w="5871"/>
+      </w:tblGrid>
+      <w:tr>
+        <w:tc>
+          <w:tcPr>
+            <w:tcW w:w="2121" w:type="pct"/>
+            <w:hideMark/>
+          </w:tcPr>
+          <w:p>
+            <w:pPr>
+              <w:spacing w:line="276" w:lineRule="auto"/>
+              <w:rPr>
+                <w:lang w:val="es-MX"/>
+              </w:rPr>
+            </w:pPr>
+            <w:r>
+              <w:rPr>
+                <w:b/>
+                <w:bCs/>
+                <w:lang w:val="es-MX"/>
+              </w:rPr>
+              <w:t>Folio:</w:t>
+            </w:r>
+            <w:r>
+              <w:rPr>
+                <w:lang w:val="es-MX"/>
+              </w:rPr>
+              <w:t xml:space="preserve"> {{folio}}</w:t>
+            </w:r>
+          </w:p>
+        </w:tc>
+        <w:tc>
+          <w:tcPr>
+            <w:tcW w:w="2879" w:type="pct"/>
+            <w:hideMark/>
+          </w:tcPr>
+          <w:p>
+            <w:pPr>
+              <w:spacing w:line="276" w:lineRule="auto"/>
+              <w:rPr>
+                <w:lang w:val="es-MX"/>
+              </w:rPr>
+            </w:pPr>
+            <w:r>
+              <w:rPr>
+                <w:b/>
+                <w:bCs/>
+                <w:lang w:val="es-MX"/>
+              </w:rPr>
+              <w:t>Fecha:</w:t>
+            </w:r>
+            <w:r>
+              <w:rPr>
+                <w:lang w:val="es-MX"/>
+              </w:rPr>
+              <w:t xml:space="preserve"> {{</w:t>
+            </w:r>
+            <w:proofErr w:type="spellStart"/>
+            <w:r>
+              <w:rPr>
+                <w:lang w:val="es-MX"/>
+              </w:rPr>
+              <w:t>fecha_hoy</w:t>
+            </w:r>
+            <w:proofErr w:type="spellEnd"/>
+            <w:r>
+              <w:rPr>
+                <w:lang w:val="es-MX"/>
+              </w:rPr>
+              <w:t>}}</w:t>
+            </w:r>
+          </w:p>
+        </w:tc>
+      </w:tr>
+    </w:tbl>
     <w:p>
       <w:pPr>
         <w:spacing w:line="276" w:lineRule="auto"/>
@@ -94,71 +137,23 @@
           <w:lang w:val="es-MX"/>
         </w:rPr>
       </w:pPr>
+    </w:p>
+    <w:p>
+      <w:pPr>
+        <w:spacing w:line="276" w:lineRule="auto"/>
+        <w:rPr>
+          <w:b/>
+          <w:bCs/>
+          <w:lang w:val="es-MX"/>
+        </w:rPr>
+      </w:pPr>
       <w:r>
         <w:rPr>
+          <w:b/>
+          <w:bCs/>
           <w:lang w:val="es-MX"/>
         </w:rPr>
-        <w:t xml:space="preserve">1. Nombre del Beneficiario: </w:t>
-      </w:r>
-      <w:r>
-        <w:rPr>
-          <w:lang w:val="es-MX"/>
-        </w:rPr>
-        <w:t>{{t_nombre}}</w:t>
-      </w:r>
-      <w:r>
-        <w:rPr>
-          <w:lang w:val="es-MX"/>
-        </w:rPr>
-        <w:t xml:space="preserve"> </w:t>
-      </w:r>
-      <w:r>
-        <w:rPr>
-          <w:lang w:val="es-MX"/>
-        </w:rPr>
-        <w:t xml:space="preserve"> </w:t>
-      </w:r>
-      <w:r>
-        <w:rPr>
-          <w:lang w:val="es-MX"/>
-        </w:rPr>
-        <w:t xml:space="preserve">Primer Apellido: </w:t>
-      </w:r>
-      <w:r>
-        <w:rPr>
-          <w:lang w:val="es-MX"/>
-        </w:rPr>
-        <w:t>{{t_ap_pat}}</w:t>
-      </w:r>
-      <w:r>
-        <w:rPr>
-          <w:lang w:val="es-MX"/>
-        </w:rPr>
-        <w:t xml:space="preserve"> </w:t>
-      </w:r>
-      <w:r>
-        <w:rPr>
-          <w:lang w:val="es-MX"/>
-        </w:rPr>
-        <w:t xml:space="preserve">  </w:t>
-      </w:r>
-      <w:r>
-        <w:rPr>
-          <w:lang w:val="es-MX"/>
-        </w:rPr>
-        <w:t xml:space="preserve">Segundo apellido: </w:t>
-      </w:r>
-      <w:r>
-        <w:rPr>
-          <w:lang w:val="es-MX"/>
-        </w:rPr>
-        <w:t>{{t_ap_mat}}</w:t>
-      </w:r>
-      <w:r>
-        <w:rPr>
-          <w:lang w:val="es-MX"/>
-        </w:rPr>
-        <w:br/>
+        <w:t>1. Datos del Beneficiario</w:t>
       </w:r>
     </w:p>
     <w:p>
@@ -168,61 +163,191 @@
           <w:lang w:val="es-MX"/>
         </w:rPr>
       </w:pPr>
-      <w:r>
-        <w:rPr>
-          <w:lang w:val="es-MX"/>
-        </w:rPr>
-        <w:t xml:space="preserve">Matrícula: </w:t>
-      </w:r>
-      <w:r>
-        <w:rPr>
-          <w:lang w:val="es-MX"/>
-        </w:rPr>
-        <w:t xml:space="preserve">{{t_matri}}  </w:t>
-      </w:r>
-      <w:r>
-        <w:rPr>
-          <w:lang w:val="es-MX"/>
-        </w:rPr>
-        <w:t xml:space="preserve"> </w:t>
-      </w:r>
-      <w:r>
-        <w:rPr>
-          <w:lang w:val="es-MX"/>
-        </w:rPr>
-        <w:t xml:space="preserve">Programa Educativo: </w:t>
-      </w:r>
-      <w:r>
-        <w:rPr>
-          <w:lang w:val="es-MX"/>
-        </w:rPr>
-        <w:t>{{t_prog}}</w:t>
-      </w:r>
-      <w:r>
-        <w:rPr>
-          <w:lang w:val="es-MX"/>
-        </w:rPr>
-        <w:t xml:space="preserve"> </w:t>
-      </w:r>
-      <w:r>
-        <w:rPr>
-          <w:lang w:val="es-MX"/>
-        </w:rPr>
-        <w:t xml:space="preserve">  </w:t>
-      </w:r>
-      <w:r>
-        <w:rPr>
-          <w:lang w:val="es-MX"/>
-        </w:rPr>
-        <w:t xml:space="preserve">Unidad Académica: </w:t>
-      </w:r>
-      <w:r>
-        <w:rPr>
-          <w:lang w:val="es-MX"/>
-        </w:rPr>
-        <w:t>{{t_uni}}</w:t>
-      </w:r>
     </w:p>
+    <w:tbl>
+      <w:tblPr>
+        <w:tblStyle w:val="Tablaconcuadrcula"/>
+        <w:tblW w:w="5000" w:type="pct"/>
+        <w:tblLook w:val="04A0" w:firstRow="1" w:lastRow="0" w:firstColumn="1" w:lastColumn="0" w:noHBand="0" w:noVBand="1"/>
+      </w:tblPr>
+      <w:tblGrid>
+        <w:gridCol w:w="2963"/>
+        <w:gridCol w:w="3479"/>
+        <w:gridCol w:w="3754"/>
+      </w:tblGrid>
+      <w:tr>
+        <w:tc>
+          <w:tcPr>
+            <w:tcW w:w="1453" w:type="pct"/>
+            <w:hideMark/>
+          </w:tcPr>
+          <w:p>
+            <w:pPr>
+              <w:spacing w:line="276" w:lineRule="auto"/>
+              <w:rPr>
+                <w:lang w:val="es-MX"/>
+              </w:rPr>
+            </w:pPr>
+            <w:r>
+              <w:rPr>
+                <w:b/>
+                <w:bCs/>
+                <w:lang w:val="es-MX"/>
+              </w:rPr>
+              <w:t>Nombre(s)</w:t>
+            </w:r>
+          </w:p>
+        </w:tc>
+        <w:tc>
+          <w:tcPr>
+            <w:tcW w:w="1706" w:type="pct"/>
+            <w:hideMark/>
+          </w:tcPr>
+          <w:p>
+            <w:pPr>
+              <w:spacing w:line="276" w:lineRule="auto"/>
+              <w:rPr>
+                <w:lang w:val="es-MX"/>
+              </w:rPr>
+            </w:pPr>
+            <w:r>
+              <w:rPr>
+                <w:b/>
+                <w:bCs/>
+                <w:lang w:val="es-MX"/>
+              </w:rPr>
+              <w:t>Primer Apellido</w:t>
+            </w:r>
+          </w:p>
+        </w:tc>
+        <w:tc>
+          <w:tcPr>
+            <w:tcW w:w="1841" w:type="pct"/>
+            <w:hideMark/>
+          </w:tcPr>
+          <w:p>
+            <w:pPr>
+              <w:spacing w:line="276" w:lineRule="auto"/>
+              <w:rPr>
+                <w:lang w:val="es-MX"/>
+              </w:rPr>
+            </w:pPr>
+            <w:r>
+              <w:rPr>
+                <w:b/>
+                <w:bCs/>
+                <w:lang w:val="es-MX"/>
+              </w:rPr>
+              <w:t>Segundo Apellido</w:t>
+            </w:r>
+          </w:p>
+        </w:tc>
+      </w:tr>
+      <w:tr>
+        <w:tc>
+          <w:tcPr>
+            <w:tcW w:w="1453" w:type="pct"/>
+            <w:hideMark/>
+          </w:tcPr>
+          <w:p>
+            <w:pPr>
+              <w:spacing w:line="276" w:lineRule="auto"/>
+              <w:rPr>
+                <w:lang w:val="es-MX"/>
+              </w:rPr>
+            </w:pPr>
+            <w:r>
+              <w:rPr>
+                <w:lang w:val="es-MX"/>
+              </w:rPr>
+              <w:t>{{</w:t>
+            </w:r>
+            <w:proofErr w:type="spellStart"/>
+            <w:r>
+              <w:rPr>
+                <w:lang w:val="es-MX"/>
+              </w:rPr>
+              <w:t>t_nombre</w:t>
+            </w:r>
+            <w:proofErr w:type="spellEnd"/>
+            <w:r>
+              <w:rPr>
+                <w:lang w:val="es-MX"/>
+              </w:rPr>
+              <w:t>}}</w:t>
+            </w:r>
+          </w:p>
+        </w:tc>
+        <w:tc>
+          <w:tcPr>
+            <w:tcW w:w="1706" w:type="pct"/>
+            <w:hideMark/>
+          </w:tcPr>
+          <w:p>
+            <w:pPr>
+              <w:spacing w:line="276" w:lineRule="auto"/>
+              <w:rPr>
+                <w:lang w:val="es-MX"/>
+              </w:rPr>
+            </w:pPr>
+            <w:r>
+              <w:rPr>
+                <w:lang w:val="es-MX"/>
+              </w:rPr>
+              <w:t>{{</w:t>
+            </w:r>
+            <w:proofErr w:type="spellStart"/>
+            <w:r>
+              <w:rPr>
+                <w:lang w:val="es-MX"/>
+              </w:rPr>
+              <w:t>t_ap_pat</w:t>
+            </w:r>
+            <w:proofErr w:type="spellEnd"/>
+            <w:r>
+              <w:rPr>
+                <w:lang w:val="es-MX"/>
+              </w:rPr>
+              <w:t>}}</w:t>
+            </w:r>
+          </w:p>
+        </w:tc>
+        <w:tc>
+          <w:tcPr>
+            <w:tcW w:w="1841" w:type="pct"/>
+            <w:hideMark/>
+          </w:tcPr>
+          <w:p>
+            <w:pPr>
+              <w:spacing w:line="276" w:lineRule="auto"/>
+              <w:rPr>
+                <w:lang w:val="es-MX"/>
+              </w:rPr>
+            </w:pPr>
+            <w:r>
+              <w:rPr>
+                <w:lang w:val="es-MX"/>
+              </w:rPr>
+              <w:t>{{</w:t>
+            </w:r>
+            <w:proofErr w:type="spellStart"/>
+            <w:r>
+              <w:rPr>
+                <w:lang w:val="es-MX"/>
+              </w:rPr>
+              <w:t>t_ap_mat</w:t>
+            </w:r>
+            <w:proofErr w:type="spellEnd"/>
+            <w:r>
+              <w:rPr>
+                <w:lang w:val="es-MX"/>
+              </w:rPr>
+              <w:t>}}</w:t>
+            </w:r>
+          </w:p>
+        </w:tc>
+      </w:tr>
+    </w:tbl>
     <w:p>
       <w:pPr>
         <w:spacing w:line="276" w:lineRule="auto"/>
@@ -230,37 +355,248 @@
           <w:lang w:val="es-MX"/>
         </w:rPr>
       </w:pPr>
-      <w:r>
-        <w:rPr>
-          <w:lang w:val="es-MX"/>
-        </w:rPr>
-        <w:t xml:space="preserve"> </w:t>
-      </w:r>
-      <w:r>
-        <w:rPr>
-          <w:lang w:val="es-MX"/>
-        </w:rPr>
-        <w:t xml:space="preserve"> </w:t>
-      </w:r>
-      <w:r>
-        <w:rPr>
-          <w:lang w:val="es-MX"/>
-        </w:rPr>
-        <w:t xml:space="preserve">Avance Académico: </w:t>
-      </w:r>
-      <w:r>
-        <w:rPr>
-          <w:lang w:val="es-MX"/>
-        </w:rPr>
-        <w:t>{{t_avan}}</w:t>
-      </w:r>
-      <w:r>
-        <w:rPr>
-          <w:lang w:val="es-MX"/>
-        </w:rPr>
-        <w:br/>
-      </w:r>
     </w:p>
+    <w:tbl>
+      <w:tblPr>
+        <w:tblStyle w:val="Tablaconcuadrcula"/>
+        <w:tblW w:w="5000" w:type="pct"/>
+        <w:tblLook w:val="04A0" w:firstRow="1" w:lastRow="0" w:firstColumn="1" w:lastColumn="0" w:noHBand="0" w:noVBand="1"/>
+      </w:tblPr>
+      <w:tblGrid>
+        <w:gridCol w:w="1731"/>
+        <w:gridCol w:w="2979"/>
+        <w:gridCol w:w="2743"/>
+        <w:gridCol w:w="2743"/>
+      </w:tblGrid>
+      <w:tr>
+        <w:tc>
+          <w:tcPr>
+            <w:tcW w:w="849" w:type="pct"/>
+            <w:hideMark/>
+          </w:tcPr>
+          <w:p>
+            <w:pPr>
+              <w:spacing w:line="276" w:lineRule="auto"/>
+              <w:rPr>
+                <w:lang w:val="es-MX"/>
+              </w:rPr>
+            </w:pPr>
+            <w:r>
+              <w:rPr>
+                <w:b/>
+                <w:bCs/>
+                <w:lang w:val="es-MX"/>
+              </w:rPr>
+              <w:t>Matrícula</w:t>
+            </w:r>
+          </w:p>
+        </w:tc>
+        <w:tc>
+          <w:tcPr>
+            <w:tcW w:w="1461" w:type="pct"/>
+            <w:hideMark/>
+          </w:tcPr>
+          <w:p>
+            <w:pPr>
+              <w:spacing w:line="276" w:lineRule="auto"/>
+              <w:rPr>
+                <w:lang w:val="es-MX"/>
+              </w:rPr>
+            </w:pPr>
+            <w:r>
+              <w:rPr>
+                <w:b/>
+                <w:bCs/>
+                <w:lang w:val="es-MX"/>
+              </w:rPr>
+              <w:t>Programa Educativo</w:t>
+            </w:r>
+          </w:p>
+        </w:tc>
+        <w:tc>
+          <w:tcPr>
+            <w:tcW w:w="1345" w:type="pct"/>
+            <w:hideMark/>
+          </w:tcPr>
+          <w:p>
+            <w:pPr>
+              <w:spacing w:line="276" w:lineRule="auto"/>
+              <w:rPr>
+                <w:lang w:val="es-MX"/>
+              </w:rPr>
+            </w:pPr>
+            <w:r>
+              <w:rPr>
+                <w:b/>
+                <w:bCs/>
+                <w:lang w:val="es-MX"/>
+              </w:rPr>
+              <w:t>Unidad Académica</w:t>
+            </w:r>
+          </w:p>
+        </w:tc>
+        <w:tc>
+          <w:tcPr>
+            <w:tcW w:w="1345" w:type="pct"/>
+            <w:hideMark/>
+          </w:tcPr>
+          <w:p>
+            <w:pPr>
+              <w:spacing w:line="276" w:lineRule="auto"/>
+              <w:rPr>
+                <w:lang w:val="es-MX"/>
+              </w:rPr>
+            </w:pPr>
+            <w:r>
+              <w:rPr>
+                <w:b/>
+                <w:bCs/>
+                <w:lang w:val="es-MX"/>
+              </w:rPr>
+              <w:t>Avance Académico</w:t>
+            </w:r>
+          </w:p>
+        </w:tc>
+      </w:tr>
+      <w:tr>
+        <w:tc>
+          <w:tcPr>
+            <w:tcW w:w="849" w:type="pct"/>
+            <w:hideMark/>
+          </w:tcPr>
+          <w:p>
+            <w:pPr>
+              <w:spacing w:line="276" w:lineRule="auto"/>
+              <w:rPr>
+                <w:lang w:val="es-MX"/>
+              </w:rPr>
+            </w:pPr>
+            <w:r>
+              <w:rPr>
+                <w:lang w:val="es-MX"/>
+              </w:rPr>
+              <w:t>{{</w:t>
+            </w:r>
+            <w:proofErr w:type="spellStart"/>
+            <w:r>
+              <w:rPr>
+                <w:lang w:val="es-MX"/>
+              </w:rPr>
+              <w:t>t_matri</w:t>
+            </w:r>
+            <w:proofErr w:type="spellEnd"/>
+            <w:r>
+              <w:rPr>
+                <w:lang w:val="es-MX"/>
+              </w:rPr>
+              <w:t>}}</w:t>
+            </w:r>
+          </w:p>
+        </w:tc>
+        <w:tc>
+          <w:tcPr>
+            <w:tcW w:w="1461" w:type="pct"/>
+            <w:hideMark/>
+          </w:tcPr>
+          <w:p>
+            <w:pPr>
+              <w:spacing w:line="276" w:lineRule="auto"/>
+              <w:rPr>
+                <w:lang w:val="es-MX"/>
+              </w:rPr>
+            </w:pPr>
+            <w:r>
+              <w:rPr>
+                <w:lang w:val="es-MX"/>
+              </w:rPr>
+              <w:t>{{</w:t>
+            </w:r>
+            <w:proofErr w:type="spellStart"/>
+            <w:r>
+              <w:rPr>
+                <w:lang w:val="es-MX"/>
+              </w:rPr>
+              <w:t>t_prog</w:t>
+            </w:r>
+            <w:proofErr w:type="spellEnd"/>
+            <w:r>
+              <w:rPr>
+                <w:lang w:val="es-MX"/>
+              </w:rPr>
+              <w:t>}}</w:t>
+            </w:r>
+          </w:p>
+        </w:tc>
+        <w:tc>
+          <w:tcPr>
+            <w:tcW w:w="1345" w:type="pct"/>
+            <w:hideMark/>
+          </w:tcPr>
+          <w:p>
+            <w:pPr>
+              <w:spacing w:line="276" w:lineRule="auto"/>
+              <w:rPr>
+                <w:lang w:val="es-MX"/>
+              </w:rPr>
+            </w:pPr>
+            <w:r>
+              <w:rPr>
+                <w:lang w:val="es-MX"/>
+              </w:rPr>
+              <w:t>{{</w:t>
+            </w:r>
+            <w:proofErr w:type="spellStart"/>
+            <w:r>
+              <w:rPr>
+                <w:lang w:val="es-MX"/>
+              </w:rPr>
+              <w:t>t_uni</w:t>
+            </w:r>
+            <w:proofErr w:type="spellEnd"/>
+            <w:r>
+              <w:rPr>
+                <w:lang w:val="es-MX"/>
+              </w:rPr>
+              <w:t>}}</w:t>
+            </w:r>
+          </w:p>
+        </w:tc>
+        <w:tc>
+          <w:tcPr>
+            <w:tcW w:w="1345" w:type="pct"/>
+            <w:hideMark/>
+          </w:tcPr>
+          <w:p>
+            <w:pPr>
+              <w:spacing w:line="276" w:lineRule="auto"/>
+              <w:rPr>
+                <w:lang w:val="es-MX"/>
+              </w:rPr>
+            </w:pPr>
+            <w:r>
+              <w:rPr>
+                <w:lang w:val="es-MX"/>
+              </w:rPr>
+              <w:t>{{</w:t>
+            </w:r>
+            <w:proofErr w:type="spellStart"/>
+            <w:r>
+              <w:rPr>
+                <w:lang w:val="es-MX"/>
+              </w:rPr>
+              <w:t>t_avan</w:t>
+            </w:r>
+            <w:proofErr w:type="spellEnd"/>
+            <w:r>
+              <w:rPr>
+                <w:lang w:val="es-MX"/>
+              </w:rPr>
+              <w:t>}}</w:t>
+            </w:r>
+          </w:p>
+        </w:tc>
+      </w:tr>
+    </w:tbl>
     <w:p>
       <w:pPr>
         <w:spacing w:line="276" w:lineRule="auto"/>
@@ -268,43 +604,248 @@
           <w:lang w:val="es-MX"/>
         </w:rPr>
       </w:pPr>
-      <w:r>
-        <w:rPr>
-          <w:lang w:val="es-MX"/>
-        </w:rPr>
-        <w:t xml:space="preserve">Correo electrónico: </w:t>
-      </w:r>
-      <w:r>
-        <w:rPr>
-          <w:lang w:val="es-MX"/>
-        </w:rPr>
-        <w:t xml:space="preserve">{{t_correo}} </w:t>
-      </w:r>
-      <w:r>
-        <w:rPr>
-          <w:lang w:val="es-MX"/>
-        </w:rPr>
-        <w:t xml:space="preserve">       </w:t>
-      </w:r>
-      <w:r>
-        <w:rPr>
-          <w:lang w:val="es-MX"/>
-        </w:rPr>
-        <w:t xml:space="preserve">Domicilio: </w:t>
-      </w:r>
-      <w:r>
-        <w:rPr>
-          <w:lang w:val="es-MX"/>
-        </w:rPr>
-        <w:t>{{t_dom}}</w:t>
-      </w:r>
-      <w:r>
-        <w:rPr>
-          <w:lang w:val="es-MX"/>
-        </w:rPr>
-        <w:t xml:space="preserve"> </w:t>
-      </w:r>
     </w:p>
+    <w:tbl>
+      <w:tblPr>
+        <w:tblStyle w:val="Tablaconcuadrcula"/>
+        <w:tblW w:w="5000" w:type="pct"/>
+        <w:tblLook w:val="04A0" w:firstRow="1" w:lastRow="0" w:firstColumn="1" w:lastColumn="0" w:noHBand="0" w:noVBand="1"/>
+      </w:tblPr>
+      <w:tblGrid>
+        <w:gridCol w:w="2959"/>
+        <w:gridCol w:w="1552"/>
+        <w:gridCol w:w="2002"/>
+        <w:gridCol w:w="3683"/>
+      </w:tblGrid>
+      <w:tr>
+        <w:tc>
+          <w:tcPr>
+            <w:tcW w:w="1451" w:type="pct"/>
+            <w:hideMark/>
+          </w:tcPr>
+          <w:p>
+            <w:pPr>
+              <w:spacing w:line="276" w:lineRule="auto"/>
+              <w:rPr>
+                <w:lang w:val="es-MX"/>
+              </w:rPr>
+            </w:pPr>
+            <w:r>
+              <w:rPr>
+                <w:b/>
+                <w:bCs/>
+                <w:lang w:val="es-MX"/>
+              </w:rPr>
+              <w:t>Correo Electrónico</w:t>
+            </w:r>
+          </w:p>
+        </w:tc>
+        <w:tc>
+          <w:tcPr>
+            <w:tcW w:w="761" w:type="pct"/>
+            <w:hideMark/>
+          </w:tcPr>
+          <w:p>
+            <w:pPr>
+              <w:spacing w:line="276" w:lineRule="auto"/>
+              <w:rPr>
+                <w:lang w:val="es-MX"/>
+              </w:rPr>
+            </w:pPr>
+            <w:r>
+              <w:rPr>
+                <w:b/>
+                <w:bCs/>
+                <w:lang w:val="es-MX"/>
+              </w:rPr>
+              <w:t>Celular</w:t>
+            </w:r>
+          </w:p>
+        </w:tc>
+        <w:tc>
+          <w:tcPr>
+            <w:tcW w:w="982" w:type="pct"/>
+            <w:hideMark/>
+          </w:tcPr>
+          <w:p>
+            <w:pPr>
+              <w:spacing w:line="276" w:lineRule="auto"/>
+              <w:rPr>
+                <w:lang w:val="es-MX"/>
+              </w:rPr>
+            </w:pPr>
+            <w:r>
+              <w:rPr>
+                <w:b/>
+                <w:bCs/>
+                <w:lang w:val="es-MX"/>
+              </w:rPr>
+              <w:t>Estado Civil</w:t>
+            </w:r>
+          </w:p>
+        </w:tc>
+        <w:tc>
+          <w:tcPr>
+            <w:tcW w:w="1806" w:type="pct"/>
+            <w:hideMark/>
+          </w:tcPr>
+          <w:p>
+            <w:pPr>
+              <w:spacing w:line="276" w:lineRule="auto"/>
+              <w:rPr>
+                <w:lang w:val="es-MX"/>
+              </w:rPr>
+            </w:pPr>
+            <w:r>
+              <w:rPr>
+                <w:b/>
+                <w:bCs/>
+                <w:lang w:val="es-MX"/>
+              </w:rPr>
+              <w:t>Parentesco con el menor</w:t>
+            </w:r>
+          </w:p>
+        </w:tc>
+      </w:tr>
+      <w:tr>
+        <w:tc>
+          <w:tcPr>
+            <w:tcW w:w="1451" w:type="pct"/>
+            <w:hideMark/>
+          </w:tcPr>
+          <w:p>
+            <w:pPr>
+              <w:spacing w:line="276" w:lineRule="auto"/>
+              <w:rPr>
+                <w:lang w:val="es-MX"/>
+              </w:rPr>
+            </w:pPr>
+            <w:r>
+              <w:rPr>
+                <w:lang w:val="es-MX"/>
+              </w:rPr>
+              <w:t>{{</w:t>
+            </w:r>
+            <w:proofErr w:type="spellStart"/>
+            <w:r>
+              <w:rPr>
+                <w:lang w:val="es-MX"/>
+              </w:rPr>
+              <w:t>t_correo</w:t>
+            </w:r>
+            <w:proofErr w:type="spellEnd"/>
+            <w:r>
+              <w:rPr>
+                <w:lang w:val="es-MX"/>
+              </w:rPr>
+              <w:t>}}</w:t>
+            </w:r>
+          </w:p>
+        </w:tc>
+        <w:tc>
+          <w:tcPr>
+            <w:tcW w:w="761" w:type="pct"/>
+            <w:hideMark/>
+          </w:tcPr>
+          <w:p>
+            <w:pPr>
+              <w:spacing w:line="276" w:lineRule="auto"/>
+              <w:rPr>
+                <w:lang w:val="es-MX"/>
+              </w:rPr>
+            </w:pPr>
+            <w:r>
+              <w:rPr>
+                <w:lang w:val="es-MX"/>
+              </w:rPr>
+              <w:t>{{</w:t>
+            </w:r>
+            <w:proofErr w:type="spellStart"/>
+            <w:r>
+              <w:rPr>
+                <w:lang w:val="es-MX"/>
+              </w:rPr>
+              <w:t>t_cel</w:t>
+            </w:r>
+            <w:proofErr w:type="spellEnd"/>
+            <w:r>
+              <w:rPr>
+                <w:lang w:val="es-MX"/>
+              </w:rPr>
+              <w:t>}}</w:t>
+            </w:r>
+          </w:p>
+        </w:tc>
+        <w:tc>
+          <w:tcPr>
+            <w:tcW w:w="982" w:type="pct"/>
+            <w:hideMark/>
+          </w:tcPr>
+          <w:p>
+            <w:pPr>
+              <w:spacing w:line="276" w:lineRule="auto"/>
+              <w:rPr>
+                <w:lang w:val="es-MX"/>
+              </w:rPr>
+            </w:pPr>
+            <w:r>
+              <w:rPr>
+                <w:lang w:val="es-MX"/>
+              </w:rPr>
+              <w:t>{{</w:t>
+            </w:r>
+            <w:proofErr w:type="spellStart"/>
+            <w:r>
+              <w:rPr>
+                <w:lang w:val="es-MX"/>
+              </w:rPr>
+              <w:t>t_civil</w:t>
+            </w:r>
+            <w:proofErr w:type="spellEnd"/>
+            <w:r>
+              <w:rPr>
+                <w:lang w:val="es-MX"/>
+              </w:rPr>
+              <w:t>}}</w:t>
+            </w:r>
+          </w:p>
+        </w:tc>
+        <w:tc>
+          <w:tcPr>
+            <w:tcW w:w="1806" w:type="pct"/>
+            <w:hideMark/>
+          </w:tcPr>
+          <w:p>
+            <w:pPr>
+              <w:spacing w:line="276" w:lineRule="auto"/>
+              <w:rPr>
+                <w:lang w:val="es-MX"/>
+              </w:rPr>
+            </w:pPr>
+            <w:r>
+              <w:rPr>
+                <w:lang w:val="es-MX"/>
+              </w:rPr>
+              <w:t>{{</w:t>
+            </w:r>
+            <w:proofErr w:type="spellStart"/>
+            <w:r>
+              <w:rPr>
+                <w:lang w:val="es-MX"/>
+              </w:rPr>
+              <w:t>t_paren</w:t>
+            </w:r>
+            <w:proofErr w:type="spellEnd"/>
+            <w:r>
+              <w:rPr>
+                <w:lang w:val="es-MX"/>
+              </w:rPr>
+              <w:t>}}</w:t>
+            </w:r>
+          </w:p>
+        </w:tc>
+      </w:tr>
+    </w:tbl>
     <w:p>
       <w:pPr>
         <w:spacing w:line="276" w:lineRule="auto"/>
@@ -313,6 +854,289 @@
         </w:rPr>
       </w:pPr>
     </w:p>
+    <w:tbl>
+      <w:tblPr>
+        <w:tblStyle w:val="Tablaconcuadrcula"/>
+        <w:tblpPr w:leftFromText="141" w:rightFromText="141" w:vertAnchor="text" w:horzAnchor="margin" w:tblpY="-60"/>
+        <w:tblW w:w="5000" w:type="pct"/>
+        <w:tblLook w:val="04A0" w:firstRow="1" w:lastRow="0" w:firstColumn="1" w:lastColumn="0" w:noHBand="0" w:noVBand="1"/>
+      </w:tblPr>
+      <w:tblGrid>
+        <w:gridCol w:w="10196"/>
+      </w:tblGrid>
+      <w:tr>
+        <w:tc>
+          <w:tcPr>
+            <w:tcW w:w="5000" w:type="pct"/>
+            <w:hideMark/>
+          </w:tcPr>
+          <w:p>
+            <w:pPr>
+              <w:spacing w:line="276" w:lineRule="auto"/>
+              <w:rPr>
+                <w:lang w:val="es-MX"/>
+              </w:rPr>
+            </w:pPr>
+            <w:r>
+              <w:rPr>
+                <w:b/>
+                <w:bCs/>
+                <w:lang w:val="es-MX"/>
+              </w:rPr>
+              <w:t>Domicilio</w:t>
+            </w:r>
+          </w:p>
+        </w:tc>
+      </w:tr>
+      <w:tr>
+        <w:tc>
+          <w:tcPr>
+            <w:tcW w:w="5000" w:type="pct"/>
+            <w:hideMark/>
+          </w:tcPr>
+          <w:p>
+            <w:pPr>
+              <w:spacing w:line="276" w:lineRule="auto"/>
+              <w:rPr>
+                <w:lang w:val="es-MX"/>
+              </w:rPr>
+            </w:pPr>
+            <w:r>
+              <w:rPr>
+                <w:lang w:val="es-MX"/>
+              </w:rPr>
+              <w:t>{{</w:t>
+            </w:r>
+            <w:proofErr w:type="spellStart"/>
+            <w:r>
+              <w:rPr>
+                <w:lang w:val="es-MX"/>
+              </w:rPr>
+              <w:t>t_dom</w:t>
+            </w:r>
+            <w:proofErr w:type="spellEnd"/>
+            <w:r>
+              <w:rPr>
+                <w:lang w:val="es-MX"/>
+              </w:rPr>
+              <w:t>}}</w:t>
+            </w:r>
+          </w:p>
+        </w:tc>
+      </w:tr>
+    </w:tbl>
+    <w:p>
+      <w:pPr>
+        <w:spacing w:line="276" w:lineRule="auto"/>
+        <w:rPr>
+          <w:b/>
+          <w:bCs/>
+          <w:lang w:val="es-MX"/>
+        </w:rPr>
+      </w:pPr>
+      <w:r>
+        <w:rPr>
+          <w:b/>
+          <w:bCs/>
+          <w:lang w:val="es-MX"/>
+        </w:rPr>
+        <w:t>2. Datos del Menor</w:t>
+      </w:r>
+    </w:p>
+    <w:p>
+      <w:pPr>
+        <w:spacing w:line="276" w:lineRule="auto"/>
+        <w:rPr>
+          <w:b/>
+          <w:bCs/>
+          <w:lang w:val="es-MX"/>
+        </w:rPr>
+      </w:pPr>
+    </w:p>
+    <w:tbl>
+      <w:tblPr>
+        <w:tblStyle w:val="Tablaconcuadrcula1"/>
+        <w:tblW w:w="5000" w:type="pct"/>
+        <w:tblLook w:val="04A0" w:firstRow="1" w:lastRow="0" w:firstColumn="1" w:lastColumn="0" w:noHBand="0" w:noVBand="1"/>
+      </w:tblPr>
+      <w:tblGrid>
+        <w:gridCol w:w="3116"/>
+        <w:gridCol w:w="3405"/>
+        <w:gridCol w:w="3675"/>
+      </w:tblGrid>
+      <w:tr>
+        <w:tc>
+          <w:tcPr>
+            <w:tcW w:w="1528" w:type="pct"/>
+            <w:hideMark/>
+          </w:tcPr>
+          <w:p>
+            <w:pPr>
+              <w:spacing w:line="276" w:lineRule="auto"/>
+              <w:rPr>
+                <w:lang w:val="es-MX"/>
+              </w:rPr>
+            </w:pPr>
+            <w:r>
+              <w:rPr>
+                <w:b/>
+                <w:bCs/>
+                <w:lang w:val="es-MX"/>
+              </w:rPr>
+              <w:t>Nombre(s)</w:t>
+            </w:r>
+          </w:p>
+        </w:tc>
+        <w:tc>
+          <w:tcPr>
+            <w:tcW w:w="1670" w:type="pct"/>
+            <w:hideMark/>
+          </w:tcPr>
+          <w:p>
+            <w:pPr>
+              <w:spacing w:line="276" w:lineRule="auto"/>
+              <w:rPr>
+                <w:lang w:val="es-MX"/>
+              </w:rPr>
+            </w:pPr>
+            <w:r>
+              <w:rPr>
+                <w:b/>
+                <w:bCs/>
+                <w:lang w:val="es-MX"/>
+              </w:rPr>
+              <w:t>Primer Apellido</w:t>
+            </w:r>
+          </w:p>
+        </w:tc>
+        <w:tc>
+          <w:tcPr>
+            <w:tcW w:w="1802" w:type="pct"/>
+            <w:hideMark/>
+          </w:tcPr>
+          <w:p>
+            <w:pPr>
+              <w:spacing w:line="276" w:lineRule="auto"/>
+              <w:rPr>
+                <w:lang w:val="es-MX"/>
+              </w:rPr>
+            </w:pPr>
+            <w:r>
+              <w:rPr>
+                <w:b/>
+                <w:bCs/>
+                <w:lang w:val="es-MX"/>
+              </w:rPr>
+              <w:t>Segundo Apellido</w:t>
+            </w:r>
+          </w:p>
+        </w:tc>
+      </w:tr>
+      <w:tr>
+        <w:tc>
+          <w:tcPr>
+            <w:tcW w:w="1528" w:type="pct"/>
+            <w:hideMark/>
+          </w:tcPr>
+          <w:p>
+            <w:pPr>
+              <w:spacing w:line="276" w:lineRule="auto"/>
+              <w:rPr>
+                <w:lang w:val="es-MX"/>
+              </w:rPr>
+            </w:pPr>
+            <w:r>
+              <w:rPr>
+                <w:lang w:val="es-MX"/>
+              </w:rPr>
+              <w:t>{{</w:t>
+            </w:r>
+            <w:proofErr w:type="spellStart"/>
+            <w:r>
+              <w:rPr>
+                <w:lang w:val="es-MX"/>
+              </w:rPr>
+              <w:t>m_nombre</w:t>
+            </w:r>
+            <w:proofErr w:type="spellEnd"/>
+            <w:r>
+              <w:rPr>
+                <w:lang w:val="es-MX"/>
+              </w:rPr>
+              <w:t>}}</w:t>
+            </w:r>
+          </w:p>
+        </w:tc>
+        <w:tc>
+          <w:tcPr>
+            <w:tcW w:w="1670" w:type="pct"/>
+            <w:hideMark/>
+          </w:tcPr>
+          <w:p>
+            <w:pPr>
+              <w:spacing w:line="276" w:lineRule="auto"/>
+              <w:rPr>
+                <w:lang w:val="es-MX"/>
+              </w:rPr>
+            </w:pPr>
+            <w:r>
+              <w:rPr>
+                <w:lang w:val="es-MX"/>
+              </w:rPr>
+              <w:t>{{</w:t>
+            </w:r>
+            <w:proofErr w:type="spellStart"/>
+            <w:r>
+              <w:rPr>
+                <w:lang w:val="es-MX"/>
+              </w:rPr>
+              <w:t>m_ap_pat</w:t>
+            </w:r>
+            <w:proofErr w:type="spellEnd"/>
+            <w:r>
+              <w:rPr>
+                <w:lang w:val="es-MX"/>
+              </w:rPr>
+              <w:t>}}</w:t>
+            </w:r>
+          </w:p>
+        </w:tc>
+        <w:tc>
+          <w:tcPr>
+            <w:tcW w:w="1802" w:type="pct"/>
+            <w:hideMark/>
+          </w:tcPr>
+          <w:p>
+            <w:pPr>
+              <w:spacing w:line="276" w:lineRule="auto"/>
+              <w:rPr>
+                <w:lang w:val="es-MX"/>
+              </w:rPr>
+            </w:pPr>
+            <w:r>
+              <w:rPr>
+                <w:lang w:val="es-MX"/>
+              </w:rPr>
+              <w:t>{{</w:t>
+            </w:r>
+            <w:proofErr w:type="spellStart"/>
+            <w:r>
+              <w:rPr>
+                <w:lang w:val="es-MX"/>
+              </w:rPr>
+              <w:t>m_ap_mat</w:t>
+            </w:r>
+            <w:proofErr w:type="spellEnd"/>
+            <w:r>
+              <w:rPr>
+                <w:lang w:val="es-MX"/>
+              </w:rPr>
+              <w:t>}}</w:t>
+            </w:r>
+          </w:p>
+        </w:tc>
+      </w:tr>
+    </w:tbl>
     <w:p>
       <w:pPr>
         <w:spacing w:line="276" w:lineRule="auto"/>
@@ -320,55 +1144,205 @@
           <w:lang w:val="es-MX"/>
         </w:rPr>
       </w:pPr>
-      <w:r>
-        <w:rPr>
-          <w:lang w:val="es-MX"/>
-        </w:rPr>
-        <w:t xml:space="preserve"> </w:t>
-      </w:r>
-      <w:r>
-        <w:rPr>
-          <w:lang w:val="es-MX"/>
-        </w:rPr>
-        <w:t xml:space="preserve">Celular: </w:t>
-      </w:r>
-      <w:r>
-        <w:rPr>
-          <w:lang w:val="es-MX"/>
-        </w:rPr>
-        <w:t>{</w:t>
-      </w:r>
-      <w:r>
-        <w:rPr>
-          <w:lang w:val="es-MX"/>
-        </w:rPr>
-        <w:t xml:space="preserve">{t_cel}}                   </w:t>
-      </w:r>
-      <w:r>
-        <w:rPr>
-          <w:lang w:val="es-MX"/>
-        </w:rPr>
-        <w:t xml:space="preserve">  </w:t>
-      </w:r>
-      <w:r>
-        <w:rPr>
-          <w:lang w:val="es-MX"/>
-        </w:rPr>
-        <w:t xml:space="preserve">Estado Civil: </w:t>
-      </w:r>
-      <w:r>
-        <w:rPr>
-          <w:lang w:val="es-MX"/>
-        </w:rPr>
-        <w:t>{{t_civil}}</w:t>
-      </w:r>
-      <w:r>
-        <w:rPr>
-          <w:lang w:val="es-MX"/>
-        </w:rPr>
-        <w:t xml:space="preserve"> </w:t>
-      </w:r>
     </w:p>
+    <w:tbl>
+      <w:tblPr>
+        <w:tblStyle w:val="Tablaconcuadrcula"/>
+        <w:tblW w:w="5000" w:type="pct"/>
+        <w:tblLook w:val="04A0" w:firstRow="1" w:lastRow="0" w:firstColumn="1" w:lastColumn="0" w:noHBand="0" w:noVBand="1"/>
+      </w:tblPr>
+      <w:tblGrid>
+        <w:gridCol w:w="5002"/>
+        <w:gridCol w:w="2612"/>
+        <w:gridCol w:w="2582"/>
+      </w:tblGrid>
+      <w:tr>
+        <w:tc>
+          <w:tcPr>
+            <w:tcW w:w="2453" w:type="pct"/>
+            <w:hideMark/>
+          </w:tcPr>
+          <w:p>
+            <w:pPr>
+              <w:spacing w:line="276" w:lineRule="auto"/>
+              <w:rPr>
+                <w:lang w:val="es-MX"/>
+              </w:rPr>
+            </w:pPr>
+            <w:r>
+              <w:rPr>
+                <w:b/>
+                <w:bCs/>
+                <w:lang w:val="es-MX"/>
+              </w:rPr>
+              <w:t>Edad</w:t>
+            </w:r>
+          </w:p>
+        </w:tc>
+        <w:tc>
+          <w:tcPr>
+            <w:tcW w:w="1281" w:type="pct"/>
+            <w:hideMark/>
+          </w:tcPr>
+          <w:p>
+            <w:pPr>
+              <w:spacing w:line="276" w:lineRule="auto"/>
+              <w:rPr>
+                <w:lang w:val="es-MX"/>
+              </w:rPr>
+            </w:pPr>
+            <w:r>
+              <w:rPr>
+                <w:b/>
+                <w:bCs/>
+                <w:lang w:val="es-MX"/>
+              </w:rPr>
+              <w:t>Lugar de Nacimiento</w:t>
+            </w:r>
+          </w:p>
+        </w:tc>
+        <w:tc>
+          <w:tcPr>
+            <w:tcW w:w="1266" w:type="pct"/>
+            <w:hideMark/>
+          </w:tcPr>
+          <w:p>
+            <w:pPr>
+              <w:spacing w:line="276" w:lineRule="auto"/>
+              <w:rPr>
+                <w:lang w:val="es-MX"/>
+              </w:rPr>
+            </w:pPr>
+            <w:r>
+              <w:rPr>
+                <w:b/>
+                <w:bCs/>
+                <w:lang w:val="es-MX"/>
+              </w:rPr>
+              <w:t>Fecha de Nacimiento</w:t>
+            </w:r>
+          </w:p>
+        </w:tc>
+      </w:tr>
+      <w:tr>
+        <w:tc>
+          <w:tcPr>
+            <w:tcW w:w="2453" w:type="pct"/>
+            <w:hideMark/>
+          </w:tcPr>
+          <w:p>
+            <w:pPr>
+              <w:spacing w:line="276" w:lineRule="auto"/>
+              <w:rPr>
+                <w:lang w:val="es-MX"/>
+              </w:rPr>
+            </w:pPr>
+            <w:r>
+              <w:rPr>
+                <w:lang w:val="es-MX"/>
+              </w:rPr>
+              <w:t>{{</w:t>
+            </w:r>
+            <w:proofErr w:type="spellStart"/>
+            <w:r>
+              <w:rPr>
+                <w:lang w:val="es-MX"/>
+              </w:rPr>
+              <w:t>m_edad_a</w:t>
+            </w:r>
+            <w:proofErr w:type="spellEnd"/>
+            <w:r>
+              <w:rPr>
+                <w:lang w:val="es-MX"/>
+              </w:rPr>
+              <w:t>}} años y {{</w:t>
+            </w:r>
+            <w:proofErr w:type="spellStart"/>
+            <w:r>
+              <w:rPr>
+                <w:lang w:val="es-MX"/>
+              </w:rPr>
+              <w:t>m_edad_m</w:t>
+            </w:r>
+            <w:proofErr w:type="spellEnd"/>
+            <w:r>
+              <w:rPr>
+                <w:lang w:val="es-MX"/>
+              </w:rPr>
+              <w:t>}} meses</w:t>
+            </w:r>
+          </w:p>
+        </w:tc>
+        <w:tc>
+          <w:tcPr>
+            <w:tcW w:w="1281" w:type="pct"/>
+            <w:hideMark/>
+          </w:tcPr>
+          <w:p>
+            <w:pPr>
+              <w:spacing w:line="276" w:lineRule="auto"/>
+              <w:rPr>
+                <w:lang w:val="es-MX"/>
+              </w:rPr>
+            </w:pPr>
+            <w:r>
+              <w:rPr>
+                <w:lang w:val="es-MX"/>
+              </w:rPr>
+              <w:t>{{</w:t>
+            </w:r>
+            <w:proofErr w:type="spellStart"/>
+            <w:r>
+              <w:rPr>
+                <w:lang w:val="es-MX"/>
+              </w:rPr>
+              <w:t>m_lugar</w:t>
+            </w:r>
+            <w:proofErr w:type="spellEnd"/>
+            <w:r>
+              <w:rPr>
+                <w:lang w:val="es-MX"/>
+              </w:rPr>
+              <w:t>}}</w:t>
+            </w:r>
+          </w:p>
+        </w:tc>
+        <w:tc>
+          <w:tcPr>
+            <w:tcW w:w="1266" w:type="pct"/>
+            <w:hideMark/>
+          </w:tcPr>
+          <w:p>
+            <w:pPr>
+              <w:spacing w:line="276" w:lineRule="auto"/>
+              <w:rPr>
+                <w:lang w:val="es-MX"/>
+              </w:rPr>
+            </w:pPr>
+            <w:r>
+              <w:rPr>
+                <w:lang w:val="es-MX"/>
+              </w:rPr>
+              <w:t>{{</w:t>
+            </w:r>
+            <w:proofErr w:type="spellStart"/>
+            <w:r>
+              <w:rPr>
+                <w:lang w:val="es-MX"/>
+              </w:rPr>
+              <w:t>m_fecha</w:t>
+            </w:r>
+            <w:proofErr w:type="spellEnd"/>
+            <w:r>
+              <w:rPr>
+                <w:lang w:val="es-MX"/>
+              </w:rPr>
+              <w:t>}}</w:t>
+            </w:r>
+          </w:p>
+        </w:tc>
+      </w:tr>
+    </w:tbl>
     <w:p>
       <w:pPr>
         <w:spacing w:line="276" w:lineRule="auto"/>
@@ -377,6 +1351,190 @@
         </w:rPr>
       </w:pPr>
     </w:p>
+    <w:tbl>
+      <w:tblPr>
+        <w:tblStyle w:val="Tablaconcuadrcula"/>
+        <w:tblW w:w="5000" w:type="pct"/>
+        <w:tblLook w:val="04A0" w:firstRow="1" w:lastRow="0" w:firstColumn="1" w:lastColumn="0" w:noHBand="0" w:noVBand="1"/>
+      </w:tblPr>
+      <w:tblGrid>
+        <w:gridCol w:w="3148"/>
+        <w:gridCol w:w="3930"/>
+        <w:gridCol w:w="3118"/>
+      </w:tblGrid>
+      <w:tr>
+        <w:tc>
+          <w:tcPr>
+            <w:tcW w:w="1544" w:type="pct"/>
+            <w:hideMark/>
+          </w:tcPr>
+          <w:p>
+            <w:pPr>
+              <w:spacing w:line="276" w:lineRule="auto"/>
+              <w:rPr>
+                <w:lang w:val="es-MX"/>
+              </w:rPr>
+            </w:pPr>
+            <w:r>
+              <w:rPr>
+                <w:b/>
+                <w:bCs/>
+                <w:lang w:val="es-MX"/>
+              </w:rPr>
+              <w:t>Sexo</w:t>
+            </w:r>
+          </w:p>
+        </w:tc>
+        <w:tc>
+          <w:tcPr>
+            <w:tcW w:w="1927" w:type="pct"/>
+            <w:hideMark/>
+          </w:tcPr>
+          <w:p>
+            <w:pPr>
+              <w:spacing w:line="276" w:lineRule="auto"/>
+              <w:rPr>
+                <w:lang w:val="es-MX"/>
+              </w:rPr>
+            </w:pPr>
+            <w:r>
+              <w:rPr>
+                <w:b/>
+                <w:bCs/>
+                <w:lang w:val="es-MX"/>
+              </w:rPr>
+              <w:t>Tipo de Sangre</w:t>
+            </w:r>
+          </w:p>
+        </w:tc>
+        <w:tc>
+          <w:tcPr>
+            <w:tcW w:w="1529" w:type="pct"/>
+            <w:hideMark/>
+          </w:tcPr>
+          <w:p>
+            <w:pPr>
+              <w:spacing w:line="276" w:lineRule="auto"/>
+              <w:rPr>
+                <w:lang w:val="es-MX"/>
+              </w:rPr>
+            </w:pPr>
+            <w:r>
+              <w:rPr>
+                <w:b/>
+                <w:bCs/>
+                <w:lang w:val="es-MX"/>
+              </w:rPr>
+              <w:t>CURP</w:t>
+            </w:r>
+          </w:p>
+        </w:tc>
+      </w:tr>
+      <w:tr>
+        <w:tc>
+          <w:tcPr>
+            <w:tcW w:w="1544" w:type="pct"/>
+            <w:hideMark/>
+          </w:tcPr>
+          <w:p>
+            <w:pPr>
+              <w:spacing w:line="276" w:lineRule="auto"/>
+              <w:rPr>
+                <w:lang w:val="es-MX"/>
+              </w:rPr>
+            </w:pPr>
+            <w:r>
+              <w:rPr>
+                <w:lang w:val="es-MX"/>
+              </w:rPr>
+              <w:t>{{</w:t>
+            </w:r>
+            <w:proofErr w:type="spellStart"/>
+            <w:r>
+              <w:rPr>
+                <w:lang w:val="es-MX"/>
+              </w:rPr>
+              <w:t>m_sexo</w:t>
+            </w:r>
+            <w:proofErr w:type="spellEnd"/>
+            <w:r>
+              <w:rPr>
+                <w:lang w:val="es-MX"/>
+              </w:rPr>
+              <w:t>}}</w:t>
+            </w:r>
+          </w:p>
+        </w:tc>
+        <w:tc>
+          <w:tcPr>
+            <w:tcW w:w="1927" w:type="pct"/>
+            <w:hideMark/>
+          </w:tcPr>
+          <w:p>
+            <w:pPr>
+              <w:spacing w:line="276" w:lineRule="auto"/>
+              <w:rPr>
+                <w:lang w:val="es-MX"/>
+              </w:rPr>
+            </w:pPr>
+            <w:r>
+              <w:rPr>
+                <w:lang w:val="es-MX"/>
+              </w:rPr>
+              <w:t>{{</w:t>
+            </w:r>
+            <w:proofErr w:type="spellStart"/>
+            <w:r>
+              <w:rPr>
+                <w:lang w:val="es-MX"/>
+              </w:rPr>
+              <w:t>m_sangre</w:t>
+            </w:r>
+            <w:proofErr w:type="spellEnd"/>
+            <w:r>
+              <w:rPr>
+                <w:lang w:val="es-MX"/>
+              </w:rPr>
+              <w:t>}}</w:t>
+            </w:r>
+          </w:p>
+        </w:tc>
+        <w:tc>
+          <w:tcPr>
+            <w:tcW w:w="1529" w:type="pct"/>
+            <w:hideMark/>
+          </w:tcPr>
+          <w:p>
+            <w:pPr>
+              <w:spacing w:line="276" w:lineRule="auto"/>
+              <w:rPr>
+                <w:lang w:val="es-MX"/>
+              </w:rPr>
+            </w:pPr>
+            <w:r>
+              <w:rPr>
+                <w:lang w:val="es-MX"/>
+              </w:rPr>
+              <w:t>{{</w:t>
+            </w:r>
+            <w:proofErr w:type="spellStart"/>
+            <w:r>
+              <w:rPr>
+                <w:lang w:val="es-MX"/>
+              </w:rPr>
+              <w:t>m_curp</w:t>
+            </w:r>
+            <w:proofErr w:type="spellEnd"/>
+            <w:r>
+              <w:rPr>
+                <w:lang w:val="es-MX"/>
+              </w:rPr>
+              <w:t>}}</w:t>
+            </w:r>
+          </w:p>
+        </w:tc>
+      </w:tr>
+    </w:tbl>
     <w:p>
       <w:pPr>
         <w:spacing w:line="276" w:lineRule="auto"/>
@@ -384,102 +1542,23 @@
           <w:lang w:val="es-MX"/>
         </w:rPr>
       </w:pPr>
+    </w:p>
+    <w:p>
+      <w:pPr>
+        <w:spacing w:line="276" w:lineRule="auto"/>
+        <w:rPr>
+          <w:b/>
+          <w:bCs/>
+          <w:lang w:val="es-MX"/>
+        </w:rPr>
+      </w:pPr>
       <w:r>
         <w:rPr>
+          <w:b/>
+          <w:bCs/>
           <w:lang w:val="es-MX"/>
         </w:rPr>
-        <w:t xml:space="preserve">Parentesco con el menor: </w:t>
-      </w:r>
-      <w:r>
-        <w:rPr>
-          <w:lang w:val="es-MX"/>
-        </w:rPr>
-        <w:t>{{t_paren}}</w:t>
-      </w:r>
-      <w:r>
-        <w:rPr>
-          <w:lang w:val="es-MX"/>
-        </w:rPr>
-        <w:br/>
-      </w:r>
-      <w:r>
-        <w:rPr>
-          <w:lang w:val="es-MX"/>
-        </w:rPr>
-        <w:br/>
-      </w:r>
-      <w:r>
-        <w:rPr>
-          <w:lang w:val="es-MX"/>
-        </w:rPr>
-        <w:br/>
-        <w:t xml:space="preserve">2. Nombre del menor: </w:t>
-      </w:r>
-      <w:r>
-        <w:rPr>
-          <w:lang w:val="es-MX"/>
-        </w:rPr>
-        <w:t>{{m_nombre}}</w:t>
-      </w:r>
-      <w:r>
-        <w:rPr>
-          <w:lang w:val="es-MX"/>
-        </w:rPr>
-        <w:t xml:space="preserve"> </w:t>
-      </w:r>
-      <w:r>
-        <w:rPr>
-          <w:lang w:val="es-MX"/>
-        </w:rPr>
-        <w:t xml:space="preserve"> </w:t>
-      </w:r>
-      <w:r>
-        <w:rPr>
-          <w:lang w:val="es-MX"/>
-        </w:rPr>
-        <w:t xml:space="preserve">Primer Apellido: </w:t>
-      </w:r>
-      <w:r>
-        <w:rPr>
-          <w:lang w:val="es-MX"/>
-        </w:rPr>
-        <w:t>{{m_ap_pat}}</w:t>
-      </w:r>
-      <w:r>
-        <w:rPr>
-          <w:lang w:val="es-MX"/>
-        </w:rPr>
-        <w:t xml:space="preserve"> </w:t>
-      </w:r>
-      <w:r>
-        <w:rPr>
-          <w:lang w:val="es-MX"/>
-        </w:rPr>
-        <w:t xml:space="preserve"> </w:t>
-      </w:r>
-      <w:r>
-        <w:rPr>
-          <w:lang w:val="es-MX"/>
-        </w:rPr>
-        <w:t xml:space="preserve">Segundo apellido: </w:t>
-      </w:r>
-      <w:r>
-        <w:rPr>
-          <w:lang w:val="es-MX"/>
-        </w:rPr>
-        <w:t>{{m_ap_mat}}</w:t>
-      </w:r>
-      <w:r>
-        <w:rPr>
-          <w:lang w:val="es-MX"/>
-        </w:rPr>
-        <w:t xml:space="preserve"> </w:t>
-      </w:r>
-      <w:r>
-        <w:rPr>
-          <w:lang w:val="es-MX"/>
-        </w:rPr>
-        <w:br/>
+        <w:t>3. Datos del Padre/Madre</w:t>
       </w:r>
     </w:p>
     <w:p>
@@ -489,109 +1568,149 @@
           <w:lang w:val="es-MX"/>
         </w:rPr>
       </w:pPr>
-      <w:r>
-        <w:rPr>
-          <w:lang w:val="es-MX"/>
-        </w:rPr>
-        <w:t xml:space="preserve">Edad: </w:t>
-      </w:r>
-      <w:r>
-        <w:rPr>
-          <w:lang w:val="es-MX"/>
-        </w:rPr>
-        <w:t>{{m_edad_a}}</w:t>
-      </w:r>
-      <w:r>
-        <w:rPr>
-          <w:lang w:val="es-MX"/>
-        </w:rPr>
-        <w:t xml:space="preserve"> </w:t>
-      </w:r>
-      <w:r>
-        <w:rPr>
-          <w:lang w:val="es-MX"/>
-        </w:rPr>
-        <w:t>a.</w:t>
-      </w:r>
-      <w:r>
-        <w:rPr>
-          <w:lang w:val="es-MX"/>
-        </w:rPr>
-        <w:t xml:space="preserve"> </w:t>
-      </w:r>
-      <w:r>
-        <w:rPr>
-          <w:lang w:val="es-MX"/>
-        </w:rPr>
-        <w:t>{{m_edad_m}}</w:t>
-      </w:r>
-      <w:r>
-        <w:rPr>
-          <w:lang w:val="es-MX"/>
-        </w:rPr>
-        <w:t xml:space="preserve"> </w:t>
-      </w:r>
-      <w:r>
-        <w:rPr>
-          <w:lang w:val="es-MX"/>
-        </w:rPr>
-        <w:t>m.</w:t>
-      </w:r>
-      <w:r>
-        <w:rPr>
-          <w:lang w:val="es-MX"/>
-        </w:rPr>
-        <w:t xml:space="preserve">  </w:t>
-      </w:r>
-      <w:r>
-        <w:rPr>
-          <w:lang w:val="es-MX"/>
-        </w:rPr>
-        <w:t xml:space="preserve">Lugar de nacimiento: </w:t>
-      </w:r>
-      <w:r>
-        <w:rPr>
-          <w:lang w:val="es-MX"/>
-        </w:rPr>
-        <w:t>{{m_lugar}}</w:t>
-      </w:r>
-      <w:r>
-        <w:rPr>
-          <w:lang w:val="es-MX"/>
-        </w:rPr>
-        <w:t xml:space="preserve"> </w:t>
-      </w:r>
-      <w:r>
-        <w:rPr>
-          <w:lang w:val="es-MX"/>
-        </w:rPr>
-        <w:t xml:space="preserve">  </w:t>
-      </w:r>
-      <w:r>
-        <w:rPr>
-          <w:lang w:val="es-MX"/>
-        </w:rPr>
-        <w:t xml:space="preserve">Fecha de nacimiento: </w:t>
-      </w:r>
-      <w:r>
-        <w:rPr>
-          <w:lang w:val="es-MX"/>
-        </w:rPr>
-        <w:t>{{m_fecha}}</w:t>
-      </w:r>
-      <w:r>
-        <w:rPr>
-          <w:lang w:val="es-MX"/>
-        </w:rPr>
-        <w:t xml:space="preserve"> </w:t>
-      </w:r>
-      <w:r>
-        <w:rPr>
-          <w:lang w:val="es-MX"/>
-        </w:rPr>
-        <w:br/>
-      </w:r>
     </w:p>
+    <w:tbl>
+      <w:tblPr>
+        <w:tblStyle w:val="Tablaconcuadrcula"/>
+        <w:tblW w:w="5000" w:type="pct"/>
+        <w:tblLook w:val="04A0" w:firstRow="1" w:lastRow="0" w:firstColumn="1" w:lastColumn="0" w:noHBand="0" w:noVBand="1"/>
+      </w:tblPr>
+      <w:tblGrid>
+        <w:gridCol w:w="3183"/>
+        <w:gridCol w:w="3373"/>
+        <w:gridCol w:w="3640"/>
+      </w:tblGrid>
+      <w:tr>
+        <w:tc>
+          <w:tcPr>
+            <w:tcW w:w="1561" w:type="pct"/>
+            <w:hideMark/>
+          </w:tcPr>
+          <w:p>
+            <w:pPr>
+              <w:spacing w:line="276" w:lineRule="auto"/>
+              <w:rPr>
+                <w:lang w:val="es-MX"/>
+              </w:rPr>
+            </w:pPr>
+            <w:r>
+              <w:rPr>
+                <w:b/>
+                <w:bCs/>
+                <w:lang w:val="es-MX"/>
+              </w:rPr>
+              <w:t>Nombre(s)</w:t>
+            </w:r>
+          </w:p>
+        </w:tc>
+        <w:tc>
+          <w:tcPr>
+            <w:tcW w:w="1654" w:type="pct"/>
+            <w:hideMark/>
+          </w:tcPr>
+          <w:p>
+            <w:pPr>
+              <w:spacing w:line="276" w:lineRule="auto"/>
+              <w:rPr>
+                <w:lang w:val="es-MX"/>
+              </w:rPr>
+            </w:pPr>
+            <w:r>
+              <w:rPr>
+                <w:b/>
+                <w:bCs/>
+                <w:lang w:val="es-MX"/>
+              </w:rPr>
+              <w:t>Primer Apellido</w:t>
+            </w:r>
+          </w:p>
+        </w:tc>
+        <w:tc>
+          <w:tcPr>
+            <w:tcW w:w="1785" w:type="pct"/>
+            <w:hideMark/>
+          </w:tcPr>
+          <w:p>
+            <w:pPr>
+              <w:spacing w:line="276" w:lineRule="auto"/>
+              <w:rPr>
+                <w:lang w:val="es-MX"/>
+              </w:rPr>
+            </w:pPr>
+            <w:r>
+              <w:rPr>
+                <w:b/>
+                <w:bCs/>
+                <w:lang w:val="es-MX"/>
+              </w:rPr>
+              <w:t>Segundo Apellido</w:t>
+            </w:r>
+          </w:p>
+        </w:tc>
+      </w:tr>
+      <w:tr>
+        <w:tc>
+          <w:tcPr>
+            <w:tcW w:w="1561" w:type="pct"/>
+            <w:hideMark/>
+          </w:tcPr>
+          <w:p>
+            <w:pPr>
+              <w:spacing w:line="276" w:lineRule="auto"/>
+              <w:rPr>
+                <w:lang w:val="es-MX"/>
+              </w:rPr>
+            </w:pPr>
+            <w:r>
+              <w:rPr>
+                <w:lang w:val="es-MX"/>
+              </w:rPr>
+              <w:t>{{p2_nombre}}</w:t>
+            </w:r>
+          </w:p>
+        </w:tc>
+        <w:tc>
+          <w:tcPr>
+            <w:tcW w:w="1654" w:type="pct"/>
+            <w:hideMark/>
+          </w:tcPr>
+          <w:p>
+            <w:pPr>
+              <w:spacing w:line="276" w:lineRule="auto"/>
+              <w:rPr>
+                <w:lang w:val="es-MX"/>
+              </w:rPr>
+            </w:pPr>
+            <w:r>
+              <w:rPr>
+                <w:lang w:val="es-MX"/>
+              </w:rPr>
+              <w:t>{{p2_ap_pat}}</w:t>
+            </w:r>
+          </w:p>
+        </w:tc>
+        <w:tc>
+          <w:tcPr>
+            <w:tcW w:w="1785" w:type="pct"/>
+            <w:hideMark/>
+          </w:tcPr>
+          <w:p>
+            <w:pPr>
+              <w:spacing w:line="276" w:lineRule="auto"/>
+              <w:rPr>
+                <w:lang w:val="es-MX"/>
+              </w:rPr>
+            </w:pPr>
+            <w:r>
+              <w:rPr>
+                <w:lang w:val="es-MX"/>
+              </w:rPr>
+              <w:t>{{p2_ap_mat}}</w:t>
+            </w:r>
+          </w:p>
+        </w:tc>
+      </w:tr>
+    </w:tbl>
     <w:p>
       <w:pPr>
         <w:spacing w:line="276" w:lineRule="auto"/>
@@ -599,140 +1718,192 @@
           <w:lang w:val="es-MX"/>
         </w:rPr>
       </w:pPr>
-      <w:r>
-        <w:rPr>
-          <w:lang w:val="es-MX"/>
-        </w:rPr>
-        <w:t xml:space="preserve">Sexo: </w:t>
-      </w:r>
-      <w:r>
-        <w:rPr>
-          <w:lang w:val="es-MX"/>
-        </w:rPr>
-        <w:t>{{m_sexo}}</w:t>
-      </w:r>
-      <w:r>
-        <w:rPr>
-          <w:lang w:val="es-MX"/>
-        </w:rPr>
-        <w:t xml:space="preserve"> </w:t>
-      </w:r>
-      <w:r>
-        <w:rPr>
-          <w:lang w:val="es-MX"/>
-        </w:rPr>
-        <w:t xml:space="preserve">  </w:t>
-      </w:r>
-      <w:r>
-        <w:rPr>
-          <w:lang w:val="es-MX"/>
-        </w:rPr>
-        <w:t xml:space="preserve">Tipo de Sangre: </w:t>
-      </w:r>
-      <w:r>
-        <w:rPr>
-          <w:lang w:val="es-MX"/>
-        </w:rPr>
-        <w:t>{{m_sangre}}</w:t>
-      </w:r>
-      <w:r>
-        <w:rPr>
-          <w:lang w:val="es-MX"/>
-        </w:rPr>
-        <w:t xml:space="preserve"> </w:t>
-      </w:r>
-      <w:r>
-        <w:rPr>
-          <w:lang w:val="es-MX"/>
-        </w:rPr>
-        <w:t xml:space="preserve">    </w:t>
-      </w:r>
-      <w:r>
-        <w:rPr>
-          <w:lang w:val="es-MX"/>
-        </w:rPr>
-        <w:t xml:space="preserve">CURP: </w:t>
-      </w:r>
-      <w:r>
-        <w:rPr>
-          <w:lang w:val="es-MX"/>
-        </w:rPr>
-        <w:t>{{m_curp}}</w:t>
-      </w:r>
-      <w:r>
-        <w:rPr>
-          <w:lang w:val="es-MX"/>
-        </w:rPr>
-        <w:br/>
-      </w:r>
-      <w:r>
-        <w:rPr>
-          <w:lang w:val="es-MX"/>
-        </w:rPr>
-        <w:br/>
-        <w:t xml:space="preserve">3. Nombre del Padre/Madre: </w:t>
-      </w:r>
-      <w:r>
-        <w:rPr>
-          <w:lang w:val="es-MX"/>
-        </w:rPr>
-        <w:t>{{p2_nombre}}</w:t>
-      </w:r>
-      <w:r>
-        <w:rPr>
-          <w:lang w:val="es-MX"/>
-        </w:rPr>
-        <w:t xml:space="preserve"> </w:t>
-      </w:r>
-      <w:r>
-        <w:rPr>
-          <w:lang w:val="es-MX"/>
-        </w:rPr>
-        <w:t xml:space="preserve">   </w:t>
-      </w:r>
-      <w:r>
-        <w:rPr>
-          <w:lang w:val="es-MX"/>
-        </w:rPr>
-        <w:t xml:space="preserve">Primer Apellido: </w:t>
-      </w:r>
-      <w:r>
-        <w:rPr>
-          <w:lang w:val="es-MX"/>
-        </w:rPr>
-        <w:t>{{p2_ap_pat}}</w:t>
-      </w:r>
-      <w:r>
-        <w:rPr>
-          <w:lang w:val="es-MX"/>
-        </w:rPr>
-        <w:t xml:space="preserve"> </w:t>
-      </w:r>
-      <w:r>
-        <w:rPr>
-          <w:lang w:val="es-MX"/>
-        </w:rPr>
-        <w:t xml:space="preserve">  </w:t>
-      </w:r>
-      <w:r>
-        <w:rPr>
-          <w:lang w:val="es-MX"/>
-        </w:rPr>
-        <w:t xml:space="preserve">Segundo Apellido: </w:t>
-      </w:r>
-      <w:r>
-        <w:rPr>
-          <w:lang w:val="es-MX"/>
-        </w:rPr>
-        <w:t>{{p2_ap_mat}}</w:t>
-      </w:r>
-      <w:r>
-        <w:rPr>
-          <w:lang w:val="es-MX"/>
-        </w:rPr>
-        <w:br/>
-      </w:r>
     </w:p>
+    <w:tbl>
+      <w:tblPr>
+        <w:tblStyle w:val="Tablaconcuadrcula"/>
+        <w:tblW w:w="5000" w:type="pct"/>
+        <w:tblLook w:val="04A0" w:firstRow="1" w:lastRow="0" w:firstColumn="1" w:lastColumn="0" w:noHBand="0" w:noVBand="1"/>
+      </w:tblPr>
+      <w:tblGrid>
+        <w:gridCol w:w="2286"/>
+        <w:gridCol w:w="2492"/>
+        <w:gridCol w:w="2039"/>
+        <w:gridCol w:w="3379"/>
+      </w:tblGrid>
+      <w:tr>
+        <w:tc>
+          <w:tcPr>
+            <w:tcW w:w="1121" w:type="pct"/>
+            <w:hideMark/>
+          </w:tcPr>
+          <w:p>
+            <w:pPr>
+              <w:spacing w:line="276" w:lineRule="auto"/>
+              <w:rPr>
+                <w:lang w:val="es-MX"/>
+              </w:rPr>
+            </w:pPr>
+            <w:r>
+              <w:rPr>
+                <w:b/>
+                <w:bCs/>
+                <w:lang w:val="es-MX"/>
+              </w:rPr>
+              <w:t>Estado Civil</w:t>
+            </w:r>
+          </w:p>
+        </w:tc>
+        <w:tc>
+          <w:tcPr>
+            <w:tcW w:w="1222" w:type="pct"/>
+            <w:hideMark/>
+          </w:tcPr>
+          <w:p>
+            <w:pPr>
+              <w:spacing w:line="276" w:lineRule="auto"/>
+              <w:rPr>
+                <w:lang w:val="es-MX"/>
+              </w:rPr>
+            </w:pPr>
+            <w:r>
+              <w:rPr>
+                <w:b/>
+                <w:bCs/>
+                <w:lang w:val="es-MX"/>
+              </w:rPr>
+              <w:t>Ocupación</w:t>
+            </w:r>
+          </w:p>
+        </w:tc>
+        <w:tc>
+          <w:tcPr>
+            <w:tcW w:w="1000" w:type="pct"/>
+            <w:hideMark/>
+          </w:tcPr>
+          <w:p>
+            <w:pPr>
+              <w:spacing w:line="276" w:lineRule="auto"/>
+              <w:rPr>
+                <w:lang w:val="es-MX"/>
+              </w:rPr>
+            </w:pPr>
+            <w:r>
+              <w:rPr>
+                <w:b/>
+                <w:bCs/>
+                <w:lang w:val="es-MX"/>
+              </w:rPr>
+              <w:t>Celular</w:t>
+            </w:r>
+          </w:p>
+        </w:tc>
+        <w:tc>
+          <w:tcPr>
+            <w:tcW w:w="1657" w:type="pct"/>
+            <w:hideMark/>
+          </w:tcPr>
+          <w:p>
+            <w:pPr>
+              <w:spacing w:line="276" w:lineRule="auto"/>
+              <w:rPr>
+                <w:lang w:val="es-MX"/>
+              </w:rPr>
+            </w:pPr>
+            <w:r>
+              <w:rPr>
+                <w:b/>
+                <w:bCs/>
+                <w:lang w:val="es-MX"/>
+              </w:rPr>
+              <w:t>Correo Electrónico</w:t>
+            </w:r>
+          </w:p>
+        </w:tc>
+      </w:tr>
+      <w:tr>
+        <w:tc>
+          <w:tcPr>
+            <w:tcW w:w="1121" w:type="pct"/>
+            <w:hideMark/>
+          </w:tcPr>
+          <w:p>
+            <w:pPr>
+              <w:spacing w:line="276" w:lineRule="auto"/>
+              <w:rPr>
+                <w:lang w:val="es-MX"/>
+              </w:rPr>
+            </w:pPr>
+            <w:r>
+              <w:rPr>
+                <w:lang w:val="es-MX"/>
+              </w:rPr>
+              <w:t>{{p2_civil}}</w:t>
+            </w:r>
+          </w:p>
+        </w:tc>
+        <w:tc>
+          <w:tcPr>
+            <w:tcW w:w="1222" w:type="pct"/>
+            <w:hideMark/>
+          </w:tcPr>
+          <w:p>
+            <w:pPr>
+              <w:spacing w:line="276" w:lineRule="auto"/>
+              <w:rPr>
+                <w:lang w:val="es-MX"/>
+              </w:rPr>
+            </w:pPr>
+            <w:r>
+              <w:rPr>
+                <w:lang w:val="es-MX"/>
+              </w:rPr>
+              <w:t>{{p2_ocupa}}</w:t>
+            </w:r>
+          </w:p>
+        </w:tc>
+        <w:tc>
+          <w:tcPr>
+            <w:tcW w:w="1000" w:type="pct"/>
+            <w:hideMark/>
+          </w:tcPr>
+          <w:p>
+            <w:pPr>
+              <w:spacing w:line="276" w:lineRule="auto"/>
+              <w:rPr>
+                <w:lang w:val="es-MX"/>
+              </w:rPr>
+            </w:pPr>
+            <w:r>
+              <w:rPr>
+                <w:lang w:val="es-MX"/>
+              </w:rPr>
+              <w:t>{{p2_cel}}</w:t>
+            </w:r>
+          </w:p>
+        </w:tc>
+        <w:tc>
+          <w:tcPr>
+            <w:tcW w:w="1657" w:type="pct"/>
+            <w:hideMark/>
+          </w:tcPr>
+          <w:p>
+            <w:pPr>
+              <w:spacing w:line="276" w:lineRule="auto"/>
+              <w:rPr>
+                <w:lang w:val="es-MX"/>
+              </w:rPr>
+            </w:pPr>
+            <w:r>
+              <w:rPr>
+                <w:lang w:val="es-MX"/>
+              </w:rPr>
+              <w:t>{{p2_correo}}</w:t>
+            </w:r>
+          </w:p>
+        </w:tc>
+      </w:tr>
+    </w:tbl>
     <w:p>
       <w:pPr>
         <w:spacing w:line="276" w:lineRule="auto"/>
@@ -740,85 +1911,64 @@
           <w:lang w:val="es-MX"/>
         </w:rPr>
       </w:pPr>
-      <w:r>
-        <w:rPr>
-          <w:lang w:val="es-MX"/>
-        </w:rPr>
-        <w:t xml:space="preserve">Estado Civil: </w:t>
-      </w:r>
-      <w:r>
-        <w:rPr>
-          <w:lang w:val="es-MX"/>
-        </w:rPr>
-        <w:t>{{p2_civil}}</w:t>
-      </w:r>
-      <w:r>
-        <w:rPr>
-          <w:lang w:val="es-MX"/>
-        </w:rPr>
-        <w:t xml:space="preserve">  </w:t>
-      </w:r>
-      <w:r>
-        <w:rPr>
-          <w:lang w:val="es-MX"/>
-        </w:rPr>
-        <w:t xml:space="preserve">Ocupación: </w:t>
-      </w:r>
-      <w:r>
-        <w:rPr>
-          <w:lang w:val="es-MX"/>
-        </w:rPr>
-        <w:t>{{p2_ocupa}}</w:t>
-      </w:r>
-      <w:r>
-        <w:rPr>
-          <w:lang w:val="es-MX"/>
-        </w:rPr>
-        <w:t xml:space="preserve">   </w:t>
-      </w:r>
-      <w:r>
-        <w:rPr>
-          <w:lang w:val="es-MX"/>
-        </w:rPr>
-        <w:t xml:space="preserve">Domicilio: </w:t>
-      </w:r>
-      <w:r>
-        <w:rPr>
-          <w:lang w:val="es-MX"/>
-        </w:rPr>
-        <w:t>{{p2_dom}}</w:t>
-      </w:r>
-      <w:r>
-        <w:rPr>
-          <w:lang w:val="es-MX"/>
-        </w:rPr>
-        <w:t xml:space="preserve">   </w:t>
-      </w:r>
-      <w:r>
-        <w:rPr>
-          <w:lang w:val="es-MX"/>
-        </w:rPr>
-        <w:t xml:space="preserve">Celular: </w:t>
-      </w:r>
-      <w:r>
-        <w:rPr>
-          <w:lang w:val="es-MX"/>
-        </w:rPr>
-        <w:t>{{p2_cel}}</w:t>
-      </w:r>
-      <w:r>
-        <w:rPr>
-          <w:lang w:val="es-MX"/>
-        </w:rPr>
-        <w:t xml:space="preserve"> </w:t>
-      </w:r>
-      <w:r>
-        <w:rPr>
-          <w:lang w:val="es-MX"/>
-        </w:rPr>
-        <w:br/>
-      </w:r>
     </w:p>
+    <w:tbl>
+      <w:tblPr>
+        <w:tblStyle w:val="Tablaconcuadrcula"/>
+        <w:tblpPr w:leftFromText="141" w:rightFromText="141" w:vertAnchor="text" w:horzAnchor="margin" w:tblpY="-34"/>
+        <w:tblW w:w="5000" w:type="pct"/>
+        <w:tblLook w:val="04A0" w:firstRow="1" w:lastRow="0" w:firstColumn="1" w:lastColumn="0" w:noHBand="0" w:noVBand="1"/>
+      </w:tblPr>
+      <w:tblGrid>
+        <w:gridCol w:w="10196"/>
+      </w:tblGrid>
+      <w:tr>
+        <w:tc>
+          <w:tcPr>
+            <w:tcW w:w="5000" w:type="pct"/>
+            <w:hideMark/>
+          </w:tcPr>
+          <w:p>
+            <w:pPr>
+              <w:spacing w:line="276" w:lineRule="auto"/>
+              <w:rPr>
+                <w:lang w:val="es-MX"/>
+              </w:rPr>
+            </w:pPr>
+            <w:r>
+              <w:rPr>
+                <w:b/>
+                <w:bCs/>
+                <w:lang w:val="es-MX"/>
+              </w:rPr>
+              <w:t>Domicilio</w:t>
+            </w:r>
+          </w:p>
+        </w:tc>
+      </w:tr>
+      <w:tr>
+        <w:tc>
+          <w:tcPr>
+            <w:tcW w:w="5000" w:type="pct"/>
+            <w:hideMark/>
+          </w:tcPr>
+          <w:p>
+            <w:pPr>
+              <w:spacing w:line="276" w:lineRule="auto"/>
+              <w:rPr>
+                <w:lang w:val="es-MX"/>
+              </w:rPr>
+            </w:pPr>
+            <w:r>
+              <w:rPr>
+                <w:lang w:val="es-MX"/>
+              </w:rPr>
+              <w:t>{{p2_dom}}</w:t>
+            </w:r>
+          </w:p>
+        </w:tc>
+      </w:tr>
+    </w:tbl>
     <w:p>
       <w:pPr>
         <w:spacing w:line="276" w:lineRule="auto"/>
@@ -826,24 +1976,6 @@
           <w:lang w:val="es-MX"/>
         </w:rPr>
       </w:pPr>
-      <w:r>
-        <w:rPr>
-          <w:lang w:val="es-MX"/>
-        </w:rPr>
-        <w:t xml:space="preserve">Correo electrónico: </w:t>
-      </w:r>
-      <w:r>
-        <w:rPr>
-          <w:lang w:val="es-MX"/>
-        </w:rPr>
-        <w:t>{{p2_correo}}</w:t>
-      </w:r>
-      <w:r>
-        <w:rPr>
-          <w:lang w:val="es-MX"/>
-        </w:rPr>
-        <w:br/>
-      </w:r>
     </w:p>
     <w:p>
       <w:pPr>
@@ -852,181 +1984,6 @@
           <w:lang w:val="es-MX"/>
         </w:rPr>
       </w:pPr>
-      <w:r>
-        <w:rPr>
-          <w:lang w:val="es-MX"/>
-        </w:rPr>
-        <w:t xml:space="preserve">4. Teléfono de un familiar: </w:t>
-      </w:r>
-      <w:r>
-        <w:rPr>
-          <w:lang w:val="es-MX"/>
-        </w:rPr>
-        <w:t>{{f1_tel}}</w:t>
-      </w:r>
-      <w:r>
-        <w:rPr>
-          <w:lang w:val="es-MX"/>
-        </w:rPr>
-        <w:t xml:space="preserve"> </w:t>
-      </w:r>
-      <w:r>
-        <w:rPr>
-          <w:lang w:val="es-MX"/>
-        </w:rPr>
-        <w:t xml:space="preserve">  </w:t>
-      </w:r>
-      <w:r>
-        <w:rPr>
-          <w:lang w:val="es-MX"/>
-        </w:rPr>
-        <w:t xml:space="preserve">Nombre: </w:t>
-      </w:r>
-      <w:r>
-        <w:rPr>
-          <w:lang w:val="es-MX"/>
-        </w:rPr>
-        <w:t>{{f1_nom}}</w:t>
-      </w:r>
-      <w:r>
-        <w:rPr>
-          <w:lang w:val="es-MX"/>
-        </w:rPr>
-        <w:t xml:space="preserve"> </w:t>
-      </w:r>
-      <w:r>
-        <w:rPr>
-          <w:lang w:val="es-MX"/>
-        </w:rPr>
-        <w:t xml:space="preserve">  </w:t>
-      </w:r>
-      <w:r>
-        <w:rPr>
-          <w:lang w:val="es-MX"/>
-        </w:rPr>
-        <w:t xml:space="preserve">Primer apellido: </w:t>
-      </w:r>
-      <w:r>
-        <w:rPr>
-          <w:lang w:val="es-MX"/>
-        </w:rPr>
-        <w:t>{{f1_pat}}</w:t>
-      </w:r>
-      <w:r>
-        <w:rPr>
-          <w:lang w:val="es-MX"/>
-        </w:rPr>
-        <w:t xml:space="preserve"> </w:t>
-      </w:r>
-      <w:r>
-        <w:rPr>
-          <w:lang w:val="es-MX"/>
-        </w:rPr>
-        <w:t xml:space="preserve"> </w:t>
-      </w:r>
-      <w:r>
-        <w:rPr>
-          <w:lang w:val="es-MX"/>
-        </w:rPr>
-        <w:t xml:space="preserve">Segundo Apellido: </w:t>
-      </w:r>
-      <w:r>
-        <w:rPr>
-          <w:lang w:val="es-MX"/>
-        </w:rPr>
-        <w:t>{{f1_mat}}</w:t>
-      </w:r>
-      <w:r>
-        <w:rPr>
-          <w:lang w:val="es-MX"/>
-        </w:rPr>
-        <w:t xml:space="preserve"> </w:t>
-      </w:r>
-      <w:r>
-        <w:rPr>
-          <w:lang w:val="es-MX"/>
-        </w:rPr>
-        <w:t xml:space="preserve">  </w:t>
-      </w:r>
-      <w:r>
-        <w:rPr>
-          <w:lang w:val="es-MX"/>
-        </w:rPr>
-        <w:t xml:space="preserve">Parentesco: </w:t>
-      </w:r>
-      <w:r>
-        <w:rPr>
-          <w:lang w:val="es-MX"/>
-        </w:rPr>
-        <w:t>{{f1_par}}</w:t>
-      </w:r>
-      <w:r>
-        <w:rPr>
-          <w:lang w:val="es-MX"/>
-        </w:rPr>
-        <w:br/>
-      </w:r>
-      <w:r>
-        <w:rPr>
-          <w:lang w:val="es-MX"/>
-        </w:rPr>
-        <w:br/>
-        <w:t xml:space="preserve">Teléfono de un familiar: </w:t>
-      </w:r>
-      <w:r>
-        <w:rPr>
-          <w:lang w:val="es-MX"/>
-        </w:rPr>
-        <w:t>{{f2_tel}}</w:t>
-      </w:r>
-      <w:r>
-        <w:rPr>
-          <w:lang w:val="es-MX"/>
-        </w:rPr>
-        <w:t xml:space="preserve"> </w:t>
-      </w:r>
-      <w:r>
-        <w:rPr>
-          <w:lang w:val="es-MX"/>
-        </w:rPr>
-        <w:t xml:space="preserve"> </w:t>
-      </w:r>
-      <w:r>
-        <w:rPr>
-          <w:lang w:val="es-MX"/>
-        </w:rPr>
-        <w:t xml:space="preserve">Nombre: </w:t>
-      </w:r>
-      <w:r>
-        <w:rPr>
-          <w:lang w:val="es-MX"/>
-        </w:rPr>
-        <w:t>{{f2_nom}}</w:t>
-      </w:r>
-      <w:r>
-        <w:rPr>
-          <w:lang w:val="es-MX"/>
-        </w:rPr>
-        <w:t xml:space="preserve"> </w:t>
-      </w:r>
-      <w:r>
-        <w:rPr>
-          <w:lang w:val="es-MX"/>
-        </w:rPr>
-        <w:t xml:space="preserve"> </w:t>
-      </w:r>
-      <w:r>
-        <w:rPr>
-          <w:lang w:val="es-MX"/>
-        </w:rPr>
-        <w:t xml:space="preserve">Primer apellido: </w:t>
-      </w:r>
-      <w:r>
-        <w:rPr>
-          <w:lang w:val="es-MX"/>
-        </w:rPr>
-        <w:t>{{f2_pat}}</w:t>
-      </w:r>
     </w:p>
     <w:p>
       <w:pPr>
@@ -1035,146 +1992,472 @@
           <w:lang w:val="es-MX"/>
         </w:rPr>
       </w:pPr>
+    </w:p>
+    <w:p>
+      <w:pPr>
+        <w:spacing w:line="276" w:lineRule="auto"/>
+        <w:rPr>
+          <w:b/>
+          <w:bCs/>
+          <w:lang w:val="es-MX"/>
+        </w:rPr>
+      </w:pPr>
       <w:r>
+        <w:rPr>
+          <w:b/>
+          <w:bCs/>
+          <w:lang w:val="es-MX"/>
+        </w:rPr>
+        <w:t>4. Contactos de Emergencia (Familiares)</w:t>
+      </w:r>
+    </w:p>
+    <w:p>
+      <w:pPr>
+        <w:spacing w:line="276" w:lineRule="auto"/>
         <w:rPr>
           <w:lang w:val="es-MX"/>
         </w:rPr>
-        <w:t xml:space="preserve"> </w:t>
-      </w:r>
-      <w:r>
+      </w:pPr>
+    </w:p>
+    <w:tbl>
+      <w:tblPr>
+        <w:tblStyle w:val="Tablaconcuadrcula"/>
+        <w:tblW w:w="5000" w:type="pct"/>
+        <w:tblLook w:val="04A0" w:firstRow="1" w:lastRow="0" w:firstColumn="1" w:lastColumn="0" w:noHBand="0" w:noVBand="1"/>
+      </w:tblPr>
+      <w:tblGrid>
+        <w:gridCol w:w="1839"/>
+        <w:gridCol w:w="2423"/>
+        <w:gridCol w:w="2612"/>
+        <w:gridCol w:w="1597"/>
+        <w:gridCol w:w="1725"/>
+      </w:tblGrid>
+      <w:tr>
+        <w:tc>
+          <w:tcPr>
+            <w:tcW w:w="902" w:type="pct"/>
+            <w:hideMark/>
+          </w:tcPr>
+          <w:p>
+            <w:pPr>
+              <w:spacing w:line="276" w:lineRule="auto"/>
+              <w:rPr>
+                <w:lang w:val="es-MX"/>
+              </w:rPr>
+            </w:pPr>
+            <w:r>
+              <w:rPr>
+                <w:b/>
+                <w:bCs/>
+                <w:lang w:val="es-MX"/>
+              </w:rPr>
+              <w:t>Nombre(s)</w:t>
+            </w:r>
+          </w:p>
+        </w:tc>
+        <w:tc>
+          <w:tcPr>
+            <w:tcW w:w="1188" w:type="pct"/>
+            <w:hideMark/>
+          </w:tcPr>
+          <w:p>
+            <w:pPr>
+              <w:spacing w:line="276" w:lineRule="auto"/>
+              <w:rPr>
+                <w:lang w:val="es-MX"/>
+              </w:rPr>
+            </w:pPr>
+            <w:r>
+              <w:rPr>
+                <w:b/>
+                <w:bCs/>
+                <w:lang w:val="es-MX"/>
+              </w:rPr>
+              <w:t>Primer Apellido</w:t>
+            </w:r>
+          </w:p>
+        </w:tc>
+        <w:tc>
+          <w:tcPr>
+            <w:tcW w:w="1281" w:type="pct"/>
+            <w:hideMark/>
+          </w:tcPr>
+          <w:p>
+            <w:pPr>
+              <w:spacing w:line="276" w:lineRule="auto"/>
+              <w:rPr>
+                <w:lang w:val="es-MX"/>
+              </w:rPr>
+            </w:pPr>
+            <w:r>
+              <w:rPr>
+                <w:b/>
+                <w:bCs/>
+                <w:lang w:val="es-MX"/>
+              </w:rPr>
+              <w:t>Segundo Apellido</w:t>
+            </w:r>
+          </w:p>
+        </w:tc>
+        <w:tc>
+          <w:tcPr>
+            <w:tcW w:w="783" w:type="pct"/>
+            <w:hideMark/>
+          </w:tcPr>
+          <w:p>
+            <w:pPr>
+              <w:spacing w:line="276" w:lineRule="auto"/>
+              <w:rPr>
+                <w:lang w:val="es-MX"/>
+              </w:rPr>
+            </w:pPr>
+            <w:r>
+              <w:rPr>
+                <w:b/>
+                <w:bCs/>
+                <w:lang w:val="es-MX"/>
+              </w:rPr>
+              <w:t>Teléfono</w:t>
+            </w:r>
+          </w:p>
+        </w:tc>
+        <w:tc>
+          <w:tcPr>
+            <w:tcW w:w="846" w:type="pct"/>
+            <w:hideMark/>
+          </w:tcPr>
+          <w:p>
+            <w:pPr>
+              <w:spacing w:line="276" w:lineRule="auto"/>
+              <w:rPr>
+                <w:lang w:val="es-MX"/>
+              </w:rPr>
+            </w:pPr>
+            <w:r>
+              <w:rPr>
+                <w:b/>
+                <w:bCs/>
+                <w:lang w:val="es-MX"/>
+              </w:rPr>
+              <w:t>Parentesco</w:t>
+            </w:r>
+          </w:p>
+        </w:tc>
+      </w:tr>
+      <w:tr>
+        <w:tc>
+          <w:tcPr>
+            <w:tcW w:w="902" w:type="pct"/>
+            <w:hideMark/>
+          </w:tcPr>
+          <w:p>
+            <w:pPr>
+              <w:spacing w:line="276" w:lineRule="auto"/>
+              <w:rPr>
+                <w:lang w:val="es-MX"/>
+              </w:rPr>
+            </w:pPr>
+            <w:r>
+              <w:rPr>
+                <w:lang w:val="es-MX"/>
+              </w:rPr>
+              <w:t>{{f1_nom}}</w:t>
+            </w:r>
+          </w:p>
+        </w:tc>
+        <w:tc>
+          <w:tcPr>
+            <w:tcW w:w="1188" w:type="pct"/>
+            <w:hideMark/>
+          </w:tcPr>
+          <w:p>
+            <w:pPr>
+              <w:spacing w:line="276" w:lineRule="auto"/>
+              <w:rPr>
+                <w:lang w:val="es-MX"/>
+              </w:rPr>
+            </w:pPr>
+            <w:r>
+              <w:rPr>
+                <w:lang w:val="es-MX"/>
+              </w:rPr>
+              <w:t>{{f1_pat}}</w:t>
+            </w:r>
+          </w:p>
+        </w:tc>
+        <w:tc>
+          <w:tcPr>
+            <w:tcW w:w="1281" w:type="pct"/>
+            <w:hideMark/>
+          </w:tcPr>
+          <w:p>
+            <w:pPr>
+              <w:spacing w:line="276" w:lineRule="auto"/>
+              <w:rPr>
+                <w:lang w:val="es-MX"/>
+              </w:rPr>
+            </w:pPr>
+            <w:r>
+              <w:rPr>
+                <w:lang w:val="es-MX"/>
+              </w:rPr>
+              <w:t>{{f1_mat}}</w:t>
+            </w:r>
+          </w:p>
+        </w:tc>
+        <w:tc>
+          <w:tcPr>
+            <w:tcW w:w="783" w:type="pct"/>
+            <w:hideMark/>
+          </w:tcPr>
+          <w:p>
+            <w:pPr>
+              <w:spacing w:line="276" w:lineRule="auto"/>
+              <w:rPr>
+                <w:lang w:val="es-MX"/>
+              </w:rPr>
+            </w:pPr>
+            <w:r>
+              <w:rPr>
+                <w:lang w:val="es-MX"/>
+              </w:rPr>
+              <w:t>{{f1_tel}}</w:t>
+            </w:r>
+          </w:p>
+        </w:tc>
+        <w:tc>
+          <w:tcPr>
+            <w:tcW w:w="846" w:type="pct"/>
+            <w:hideMark/>
+          </w:tcPr>
+          <w:p>
+            <w:pPr>
+              <w:spacing w:line="276" w:lineRule="auto"/>
+              <w:rPr>
+                <w:lang w:val="es-MX"/>
+              </w:rPr>
+            </w:pPr>
+            <w:r>
+              <w:rPr>
+                <w:lang w:val="es-MX"/>
+              </w:rPr>
+              <w:t>{{f1_par}}</w:t>
+            </w:r>
+          </w:p>
+        </w:tc>
+      </w:tr>
+      <w:tr>
+        <w:tc>
+          <w:tcPr>
+            <w:tcW w:w="902" w:type="pct"/>
+            <w:hideMark/>
+          </w:tcPr>
+          <w:p>
+            <w:pPr>
+              <w:spacing w:line="276" w:lineRule="auto"/>
+              <w:rPr>
+                <w:lang w:val="es-MX"/>
+              </w:rPr>
+            </w:pPr>
+            <w:r>
+              <w:rPr>
+                <w:lang w:val="es-MX"/>
+              </w:rPr>
+              <w:t>{{f2_nom}}</w:t>
+            </w:r>
+          </w:p>
+        </w:tc>
+        <w:tc>
+          <w:tcPr>
+            <w:tcW w:w="1188" w:type="pct"/>
+            <w:hideMark/>
+          </w:tcPr>
+          <w:p>
+            <w:pPr>
+              <w:spacing w:line="276" w:lineRule="auto"/>
+              <w:rPr>
+                <w:lang w:val="es-MX"/>
+              </w:rPr>
+            </w:pPr>
+            <w:r>
+              <w:rPr>
+                <w:lang w:val="es-MX"/>
+              </w:rPr>
+              <w:t>{{f2_pat}}</w:t>
+            </w:r>
+          </w:p>
+        </w:tc>
+        <w:tc>
+          <w:tcPr>
+            <w:tcW w:w="1281" w:type="pct"/>
+            <w:hideMark/>
+          </w:tcPr>
+          <w:p>
+            <w:pPr>
+              <w:spacing w:line="276" w:lineRule="auto"/>
+              <w:rPr>
+                <w:lang w:val="es-MX"/>
+              </w:rPr>
+            </w:pPr>
+            <w:r>
+              <w:rPr>
+                <w:lang w:val="es-MX"/>
+              </w:rPr>
+              <w:t>{{f2_mat}}</w:t>
+            </w:r>
+          </w:p>
+        </w:tc>
+        <w:tc>
+          <w:tcPr>
+            <w:tcW w:w="783" w:type="pct"/>
+            <w:hideMark/>
+          </w:tcPr>
+          <w:p>
+            <w:pPr>
+              <w:spacing w:line="276" w:lineRule="auto"/>
+              <w:rPr>
+                <w:lang w:val="es-MX"/>
+              </w:rPr>
+            </w:pPr>
+            <w:r>
+              <w:rPr>
+                <w:lang w:val="es-MX"/>
+              </w:rPr>
+              <w:t>{{f2_tel}}</w:t>
+            </w:r>
+          </w:p>
+        </w:tc>
+        <w:tc>
+          <w:tcPr>
+            <w:tcW w:w="846" w:type="pct"/>
+            <w:hideMark/>
+          </w:tcPr>
+          <w:p>
+            <w:pPr>
+              <w:spacing w:line="276" w:lineRule="auto"/>
+              <w:rPr>
+                <w:lang w:val="es-MX"/>
+              </w:rPr>
+            </w:pPr>
+            <w:r>
+              <w:rPr>
+                <w:lang w:val="es-MX"/>
+              </w:rPr>
+              <w:t>{{f2_par}}</w:t>
+            </w:r>
+          </w:p>
+        </w:tc>
+      </w:tr>
+      <w:tr>
+        <w:tc>
+          <w:tcPr>
+            <w:tcW w:w="902" w:type="pct"/>
+            <w:hideMark/>
+          </w:tcPr>
+          <w:p>
+            <w:pPr>
+              <w:spacing w:line="276" w:lineRule="auto"/>
+              <w:rPr>
+                <w:lang w:val="es-MX"/>
+              </w:rPr>
+            </w:pPr>
+            <w:r>
+              <w:rPr>
+                <w:lang w:val="es-MX"/>
+              </w:rPr>
+              <w:t>{{f3_nom}}</w:t>
+            </w:r>
+          </w:p>
+        </w:tc>
+        <w:tc>
+          <w:tcPr>
+            <w:tcW w:w="1188" w:type="pct"/>
+            <w:hideMark/>
+          </w:tcPr>
+          <w:p>
+            <w:pPr>
+              <w:spacing w:line="276" w:lineRule="auto"/>
+              <w:rPr>
+                <w:lang w:val="es-MX"/>
+              </w:rPr>
+            </w:pPr>
+            <w:r>
+              <w:rPr>
+                <w:lang w:val="es-MX"/>
+              </w:rPr>
+              <w:t>{{f3_pat}}</w:t>
+            </w:r>
+          </w:p>
+        </w:tc>
+        <w:tc>
+          <w:tcPr>
+            <w:tcW w:w="1281" w:type="pct"/>
+            <w:hideMark/>
+          </w:tcPr>
+          <w:p>
+            <w:pPr>
+              <w:spacing w:line="276" w:lineRule="auto"/>
+              <w:rPr>
+                <w:lang w:val="es-MX"/>
+              </w:rPr>
+            </w:pPr>
+            <w:r>
+              <w:rPr>
+                <w:lang w:val="es-MX"/>
+              </w:rPr>
+              <w:t>{{f3_mat}}</w:t>
+            </w:r>
+          </w:p>
+        </w:tc>
+        <w:tc>
+          <w:tcPr>
+            <w:tcW w:w="783" w:type="pct"/>
+            <w:hideMark/>
+          </w:tcPr>
+          <w:p>
+            <w:pPr>
+              <w:spacing w:line="276" w:lineRule="auto"/>
+              <w:rPr>
+                <w:lang w:val="es-MX"/>
+              </w:rPr>
+            </w:pPr>
+            <w:r>
+              <w:rPr>
+                <w:lang w:val="es-MX"/>
+              </w:rPr>
+              <w:t>{{f3_tel}}</w:t>
+            </w:r>
+          </w:p>
+        </w:tc>
+        <w:tc>
+          <w:tcPr>
+            <w:tcW w:w="846" w:type="pct"/>
+            <w:hideMark/>
+          </w:tcPr>
+          <w:p>
+            <w:pPr>
+              <w:spacing w:line="276" w:lineRule="auto"/>
+              <w:rPr>
+                <w:lang w:val="es-MX"/>
+              </w:rPr>
+            </w:pPr>
+            <w:r>
+              <w:rPr>
+                <w:lang w:val="es-MX"/>
+              </w:rPr>
+              <w:t>{{f3_par}}</w:t>
+            </w:r>
+          </w:p>
+        </w:tc>
+      </w:tr>
+    </w:tbl>
+    <w:p>
+      <w:pPr>
+        <w:spacing w:line="276" w:lineRule="auto"/>
         <w:rPr>
           <w:lang w:val="es-MX"/>
         </w:rPr>
-        <w:t xml:space="preserve">Segundo Apellido: </w:t>
-      </w:r>
-      <w:r>
-        <w:rPr>
-          <w:lang w:val="es-MX"/>
-        </w:rPr>
-        <w:t xml:space="preserve">{{f2_mat}}  </w:t>
-      </w:r>
-      <w:r>
-        <w:rPr>
-          <w:lang w:val="es-MX"/>
-        </w:rPr>
-        <w:t xml:space="preserve">Parentesco: </w:t>
-      </w:r>
-      <w:r>
-        <w:rPr>
-          <w:lang w:val="es-MX"/>
-        </w:rPr>
-        <w:t>{{f2_pat}}</w:t>
-      </w:r>
-      <w:r>
-        <w:rPr>
-          <w:lang w:val="es-MX"/>
-        </w:rPr>
-        <w:br/>
-      </w:r>
-      <w:r>
-        <w:rPr>
-          <w:lang w:val="es-MX"/>
-        </w:rPr>
-        <w:br/>
-        <w:t xml:space="preserve">Teléfono de un familiar: </w:t>
-      </w:r>
-      <w:r>
-        <w:rPr>
-          <w:lang w:val="es-MX"/>
-        </w:rPr>
-        <w:t xml:space="preserve">{{f3_tel}} </w:t>
-      </w:r>
-      <w:r>
-        <w:rPr>
-          <w:lang w:val="es-MX"/>
-        </w:rPr>
-        <w:t xml:space="preserve"> </w:t>
-      </w:r>
-      <w:r>
-        <w:rPr>
-          <w:lang w:val="es-MX"/>
-        </w:rPr>
-        <w:t xml:space="preserve"> </w:t>
-      </w:r>
-      <w:r>
-        <w:rPr>
-          <w:lang w:val="es-MX"/>
-        </w:rPr>
-        <w:t xml:space="preserve">Nombre: </w:t>
-      </w:r>
-      <w:r>
-        <w:rPr>
-          <w:lang w:val="es-MX"/>
-        </w:rPr>
-        <w:t>{{f3_nom}}</w:t>
-      </w:r>
-      <w:r>
-        <w:rPr>
-          <w:lang w:val="es-MX"/>
-        </w:rPr>
-        <w:t xml:space="preserve"> </w:t>
-      </w:r>
-      <w:r>
-        <w:rPr>
-          <w:lang w:val="es-MX"/>
-        </w:rPr>
-        <w:t xml:space="preserve"> </w:t>
-      </w:r>
-      <w:r>
-        <w:rPr>
-          <w:lang w:val="es-MX"/>
-        </w:rPr>
-        <w:t xml:space="preserve">Primer apellido: </w:t>
-      </w:r>
-      <w:r>
-        <w:rPr>
-          <w:lang w:val="es-MX"/>
-        </w:rPr>
-        <w:t>{{f3_pat}}</w:t>
-      </w:r>
-      <w:r>
-        <w:rPr>
-          <w:lang w:val="es-MX"/>
-        </w:rPr>
-        <w:t xml:space="preserve"> </w:t>
-      </w:r>
-      <w:r>
-        <w:rPr>
-          <w:lang w:val="es-MX"/>
-        </w:rPr>
-        <w:t xml:space="preserve"> </w:t>
-      </w:r>
-      <w:r>
-        <w:rPr>
-          <w:lang w:val="es-MX"/>
-        </w:rPr>
-        <w:t xml:space="preserve">Segundo Apellido: </w:t>
-      </w:r>
-      <w:r>
-        <w:rPr>
-          <w:lang w:val="es-MX"/>
-        </w:rPr>
-        <w:t>{{f3_mat}}</w:t>
-      </w:r>
-      <w:r>
-        <w:rPr>
-          <w:lang w:val="es-MX"/>
-        </w:rPr>
-        <w:t xml:space="preserve"> </w:t>
-      </w:r>
-      <w:r>
-        <w:rPr>
-          <w:lang w:val="es-MX"/>
-        </w:rPr>
-        <w:br/>
-        <w:t xml:space="preserve">Parentesco: </w:t>
-      </w:r>
-      <w:r>
-        <w:rPr>
-          <w:lang w:val="es-MX"/>
-        </w:rPr>
-        <w:t>{{f3_par}}</w:t>
-      </w:r>
+      </w:pPr>
     </w:p>
     <w:sectPr>
       <w:headerReference w:type="default" r:id="rId8"/>

</xml_diff>